<commit_message>
Document first-time SSH setup and feature prerequisites on a new PC
Update matching Markdown and Word handover to v1.1 with client setup, public-key authorization, host-key trust and hardware-free connection acceptance.

Co-authored-by: Copilot <223556219+Copilot@users.noreply.github.com>
</commit_message>
<xml_diff>
--- a/docs/SYSTEM_HANDOVER.zh-CN.docx
+++ b/docs/SYSTEM_HANDOVER.zh-CN.docx
@@ -22,7 +22,7 @@
         <w:rPr>
           <w:rFonts w:ascii="Arial" w:cs="Arial" w:eastAsia="Microsoft YaHei" w:hAnsi="Arial"/>
         </w:rPr>
-        <w:t xml:space="preserve">版本：1.0 | 编制日期：2026-09-21 | 状态：技术交接稿，待责任人签收</w:t>
+        <w:t xml:space="preserve">版本：1.1 | 编制日期：2026-09-21 | 状态：技术交接稿，待责任人签收</w:t>
       </w:r>
     </w:p>
     <w:p>
@@ -5834,7 +5834,7 @@
           <w:sz w:val="17"/>
           <w:szCs w:val="17"/>
         </w:rPr>
-        <w:t xml:space="preserve">git clone https://github.com/Renlonglong1/copilot-hardware-flow-kit.git</w:t>
+        <w:t xml:space="preserve">git clone --branch handover/2026-09-21-portable --single-branch https://github.com/Renlonglong1/copilot-hardware-flow-kit.git</w:t>
       </w:r>
     </w:p>
     <w:p>
@@ -6062,6 +6062,2939 @@
           <w:rFonts w:ascii="Arial" w:cs="Arial" w:eastAsia="Microsoft YaHei" w:hAnsi="Arial"/>
         </w:rPr>
         <w:t xml:space="preserve">UI 没有自带身份认证。保持本机监听；确需内网共享时，使用批准的访问控制/认证代理并限制防火墙来源，同时正确配置 server.reportBaseUrl。不得直接暴露公网。</w:t>
+      </w:r>
+    </w:p>
+    <w:p>
+      <w:pPr>
+        <w:pStyle w:val="Heading2"/>
+        <w:keepNext/>
+      </w:pPr>
+      <w:r>
+        <w:rPr>
+          <w:rFonts w:ascii="Arial" w:cs="Arial" w:eastAsia="Microsoft YaHei" w:hAnsi="Arial"/>
+        </w:rPr>
+        <w:t xml:space="preserve">6.4 新电脑迁移：系统功能与 SSH 配置是两回事</w:t>
+      </w:r>
+    </w:p>
+    <w:p>
+      <w:pPr>
+        <w:spacing w:after="120" w:line="300"/>
+      </w:pPr>
+      <w:r>
+        <w:rPr>
+          <w:rFonts w:ascii="Arial" w:cs="Arial" w:eastAsia="Microsoft YaHei" w:hAnsi="Arial"/>
+        </w:rPr>
+        <w:t xml:space="preserve">项目代码可迁移到新电脑，非硬件部分通常不需要重新开发，但不能理解为“复制目录后所有功能零配置可用”。Python、Copilot 登录、HSD 企业身份、Outlook 及本机配置仍需按各自要求准备。SSH 是远程硬件上机链路的独立前置条件，不是整个系统的统一登录方式。</w:t>
+      </w:r>
+    </w:p>
+    <w:p>
+      <w:pPr>
+        <w:spacing w:after="120" w:line="300"/>
+      </w:pPr>
+      <w:r>
+        <w:rPr>
+          <w:rFonts w:ascii="Arial" w:cs="Arial" w:eastAsia="Microsoft YaHei" w:hAnsi="Arial"/>
+        </w:rPr>
+        <w:t xml:space="preserve">新电脑默认不应被视为已经拥有旧电脑的 SSH 能力。GitHub 不携带原维护人的私钥、known_hosts 信任记录、ssh-agent 状态、个人 SSH 配置或忽略的本机运行配置；服务器也不会因为接收人能登录 GitHub 就自动允许其 SSH 登录。接收人应新建自己的身份并由控制机管理员授权，而不是复制离职人员的私钥。</w:t>
+      </w:r>
+    </w:p>
+    <w:tbl>
+      <w:tblPr>
+        <w:tblW w:type="dxa" w:w="9746"/>
+        <w:tblBorders>
+          <w:top w:val="single" w:color="auto" w:sz="4"/>
+          <w:left w:val="single" w:color="auto" w:sz="4"/>
+          <w:bottom w:val="single" w:color="auto" w:sz="4"/>
+          <w:right w:val="single" w:color="auto" w:sz="4"/>
+          <w:insideH w:val="single" w:color="auto" w:sz="4"/>
+          <w:insideV w:val="single" w:color="auto" w:sz="4"/>
+        </w:tblBorders>
+      </w:tblPr>
+      <w:tblGrid>
+        <w:gridCol w:w="2350"/>
+        <w:gridCol w:w="3550"/>
+        <w:gridCol w:w="3846"/>
+      </w:tblGrid>
+      <w:tr>
+        <w:trPr>
+          <w:cantSplit/>
+          <w:tblHeader/>
+        </w:trPr>
+        <w:tc>
+          <w:tcPr>
+            <w:tcW w:type="dxa" w:w="2350"/>
+            <w:tcBorders>
+              <w:top w:val="single" w:color="D5DBE3" w:sz="4"/>
+              <w:left w:val="single" w:color="D5DBE3" w:sz="4"/>
+              <w:bottom w:val="single" w:color="D5DBE3" w:sz="4"/>
+              <w:right w:val="single" w:color="D5DBE3" w:sz="4"/>
+            </w:tcBorders>
+            <w:shd w:fill="E8EEF5" w:val="clear"/>
+            <w:tcMar>
+              <w:top w:type="dxa" w:w="90"/>
+              <w:left w:type="dxa" w:w="100"/>
+              <w:bottom w:type="dxa" w:w="90"/>
+              <w:right w:type="dxa" w:w="100"/>
+            </w:tcMar>
+          </w:tcPr>
+          <w:p>
+            <w:pPr>
+              <w:spacing w:after="40" w:before="0" w:line="260"/>
+            </w:pPr>
+            <w:r>
+              <w:rPr>
+                <w:rFonts w:ascii="Arial" w:cs="Arial" w:eastAsia="Microsoft YaHei" w:hAnsi="Arial"/>
+                <w:b/>
+                <w:bCs/>
+                <w:sz w:val="18"/>
+                <w:szCs w:val="18"/>
+              </w:rPr>
+              <w:t xml:space="preserve">功能</w:t>
+            </w:r>
+          </w:p>
+        </w:tc>
+        <w:tc>
+          <w:tcPr>
+            <w:tcW w:type="dxa" w:w="3550"/>
+            <w:tcBorders>
+              <w:top w:val="single" w:color="D5DBE3" w:sz="4"/>
+              <w:left w:val="single" w:color="D5DBE3" w:sz="4"/>
+              <w:bottom w:val="single" w:color="D5DBE3" w:sz="4"/>
+              <w:right w:val="single" w:color="D5DBE3" w:sz="4"/>
+            </w:tcBorders>
+            <w:shd w:fill="E8EEF5" w:val="clear"/>
+            <w:tcMar>
+              <w:top w:type="dxa" w:w="90"/>
+              <w:left w:type="dxa" w:w="100"/>
+              <w:bottom w:type="dxa" w:w="90"/>
+              <w:right w:type="dxa" w:w="100"/>
+            </w:tcMar>
+          </w:tcPr>
+          <w:p>
+            <w:pPr>
+              <w:spacing w:after="40" w:before="0" w:line="260"/>
+            </w:pPr>
+            <w:r>
+              <w:rPr>
+                <w:rFonts w:ascii="Arial" w:cs="Arial" w:eastAsia="Microsoft YaHei" w:hAnsi="Arial"/>
+                <w:b/>
+                <w:bCs/>
+                <w:sz w:val="18"/>
+                <w:szCs w:val="18"/>
+              </w:rPr>
+              <w:t xml:space="preserve">是否依赖硬件 SSH</w:t>
+            </w:r>
+          </w:p>
+        </w:tc>
+        <w:tc>
+          <w:tcPr>
+            <w:tcW w:type="dxa" w:w="3846"/>
+            <w:tcBorders>
+              <w:top w:val="single" w:color="D5DBE3" w:sz="4"/>
+              <w:left w:val="single" w:color="D5DBE3" w:sz="4"/>
+              <w:bottom w:val="single" w:color="D5DBE3" w:sz="4"/>
+              <w:right w:val="single" w:color="D5DBE3" w:sz="4"/>
+            </w:tcBorders>
+            <w:shd w:fill="E8EEF5" w:val="clear"/>
+            <w:tcMar>
+              <w:top w:type="dxa" w:w="90"/>
+              <w:left w:type="dxa" w:w="100"/>
+              <w:bottom w:type="dxa" w:w="90"/>
+              <w:right w:type="dxa" w:w="100"/>
+            </w:tcMar>
+          </w:tcPr>
+          <w:p>
+            <w:pPr>
+              <w:spacing w:after="40" w:before="0" w:line="260"/>
+            </w:pPr>
+            <w:r>
+              <w:rPr>
+                <w:rFonts w:ascii="Arial" w:cs="Arial" w:eastAsia="Microsoft YaHei" w:hAnsi="Arial"/>
+                <w:b/>
+                <w:bCs/>
+                <w:sz w:val="18"/>
+                <w:szCs w:val="18"/>
+              </w:rPr>
+              <w:t xml:space="preserve">新电脑上的其他前提</w:t>
+            </w:r>
+          </w:p>
+        </w:tc>
+      </w:tr>
+      <w:tr>
+        <w:trPr>
+          <w:cantSplit/>
+          <w:tblHeader w:val="false"/>
+        </w:trPr>
+        <w:tc>
+          <w:tcPr>
+            <w:tcW w:type="dxa" w:w="2350"/>
+            <w:tcBorders>
+              <w:top w:val="single" w:color="D5DBE3" w:sz="4"/>
+              <w:left w:val="single" w:color="D5DBE3" w:sz="4"/>
+              <w:bottom w:val="single" w:color="D5DBE3" w:sz="4"/>
+              <w:right w:val="single" w:color="D5DBE3" w:sz="4"/>
+            </w:tcBorders>
+            <w:shd w:fill="FFFFFF" w:val="clear"/>
+            <w:tcMar>
+              <w:top w:type="dxa" w:w="90"/>
+              <w:left w:type="dxa" w:w="100"/>
+              <w:bottom w:type="dxa" w:w="90"/>
+              <w:right w:type="dxa" w:w="100"/>
+            </w:tcMar>
+          </w:tcPr>
+          <w:p>
+            <w:pPr>
+              <w:spacing w:after="40" w:before="0" w:line="260"/>
+            </w:pPr>
+            <w:r>
+              <w:rPr>
+                <w:rFonts w:ascii="Arial" w:cs="Arial" w:eastAsia="Microsoft YaHei" w:hAnsi="Arial"/>
+                <w:b w:val="false"/>
+                <w:bCs w:val="false"/>
+                <w:sz w:val="18"/>
+                <w:szCs w:val="18"/>
+              </w:rPr>
+              <w:t xml:space="preserve">打开本地 UI、填写表单、查看本地指南</w:t>
+            </w:r>
+          </w:p>
+        </w:tc>
+        <w:tc>
+          <w:tcPr>
+            <w:tcW w:type="dxa" w:w="3550"/>
+            <w:tcBorders>
+              <w:top w:val="single" w:color="D5DBE3" w:sz="4"/>
+              <w:left w:val="single" w:color="D5DBE3" w:sz="4"/>
+              <w:bottom w:val="single" w:color="D5DBE3" w:sz="4"/>
+              <w:right w:val="single" w:color="D5DBE3" w:sz="4"/>
+            </w:tcBorders>
+            <w:shd w:fill="FFFFFF" w:val="clear"/>
+            <w:tcMar>
+              <w:top w:type="dxa" w:w="90"/>
+              <w:left w:type="dxa" w:w="100"/>
+              <w:bottom w:type="dxa" w:w="90"/>
+              <w:right w:type="dxa" w:w="100"/>
+            </w:tcMar>
+          </w:tcPr>
+          <w:p>
+            <w:pPr>
+              <w:spacing w:after="40" w:before="0" w:line="260"/>
+            </w:pPr>
+            <w:r>
+              <w:rPr>
+                <w:rFonts w:ascii="Arial" w:cs="Arial" w:eastAsia="Microsoft YaHei" w:hAnsi="Arial"/>
+                <w:b w:val="false"/>
+                <w:bCs w:val="false"/>
+                <w:sz w:val="18"/>
+                <w:szCs w:val="18"/>
+              </w:rPr>
+              <w:t xml:space="preserve">不依赖</w:t>
+            </w:r>
+          </w:p>
+        </w:tc>
+        <w:tc>
+          <w:tcPr>
+            <w:tcW w:type="dxa" w:w="3846"/>
+            <w:tcBorders>
+              <w:top w:val="single" w:color="D5DBE3" w:sz="4"/>
+              <w:left w:val="single" w:color="D5DBE3" w:sz="4"/>
+              <w:bottom w:val="single" w:color="D5DBE3" w:sz="4"/>
+              <w:right w:val="single" w:color="D5DBE3" w:sz="4"/>
+            </w:tcBorders>
+            <w:shd w:fill="FFFFFF" w:val="clear"/>
+            <w:tcMar>
+              <w:top w:type="dxa" w:w="90"/>
+              <w:left w:type="dxa" w:w="100"/>
+              <w:bottom w:type="dxa" w:w="90"/>
+              <w:right w:type="dxa" w:w="100"/>
+            </w:tcMar>
+          </w:tcPr>
+          <w:p>
+            <w:pPr>
+              <w:spacing w:after="40" w:before="0" w:line="260"/>
+            </w:pPr>
+            <w:r>
+              <w:rPr>
+                <w:rFonts w:ascii="Arial" w:cs="Arial" w:eastAsia="Microsoft YaHei" w:hAnsi="Arial"/>
+                <w:b w:val="false"/>
+                <w:bCs w:val="false"/>
+                <w:sz w:val="18"/>
+                <w:szCs w:val="18"/>
+              </w:rPr>
+              <w:t xml:space="preserve">Python、有效 UI 配置和可读取的机器清单</w:t>
+            </w:r>
+          </w:p>
+        </w:tc>
+      </w:tr>
+      <w:tr>
+        <w:trPr>
+          <w:cantSplit/>
+          <w:tblHeader w:val="false"/>
+        </w:trPr>
+        <w:tc>
+          <w:tcPr>
+            <w:tcW w:type="dxa" w:w="2350"/>
+            <w:tcBorders>
+              <w:top w:val="single" w:color="D5DBE3" w:sz="4"/>
+              <w:left w:val="single" w:color="D5DBE3" w:sz="4"/>
+              <w:bottom w:val="single" w:color="D5DBE3" w:sz="4"/>
+              <w:right w:val="single" w:color="D5DBE3" w:sz="4"/>
+            </w:tcBorders>
+            <w:shd w:fill="FFFFFF" w:val="clear"/>
+            <w:tcMar>
+              <w:top w:type="dxa" w:w="90"/>
+              <w:left w:type="dxa" w:w="100"/>
+              <w:bottom w:type="dxa" w:w="90"/>
+              <w:right w:type="dxa" w:w="100"/>
+            </w:tcMar>
+          </w:tcPr>
+          <w:p>
+            <w:pPr>
+              <w:spacing w:after="40" w:before="0" w:line="260"/>
+            </w:pPr>
+            <w:r>
+              <w:rPr>
+                <w:rFonts w:ascii="Arial" w:cs="Arial" w:eastAsia="Microsoft YaHei" w:hAnsi="Arial"/>
+                <w:b w:val="false"/>
+                <w:bCs w:val="false"/>
+                <w:sz w:val="18"/>
+                <w:szCs w:val="18"/>
+              </w:rPr>
+              <w:t xml:space="preserve">阶段一生成计划</w:t>
+            </w:r>
+          </w:p>
+        </w:tc>
+        <w:tc>
+          <w:tcPr>
+            <w:tcW w:type="dxa" w:w="3550"/>
+            <w:tcBorders>
+              <w:top w:val="single" w:color="D5DBE3" w:sz="4"/>
+              <w:left w:val="single" w:color="D5DBE3" w:sz="4"/>
+              <w:bottom w:val="single" w:color="D5DBE3" w:sz="4"/>
+              <w:right w:val="single" w:color="D5DBE3" w:sz="4"/>
+            </w:tcBorders>
+            <w:shd w:fill="FFFFFF" w:val="clear"/>
+            <w:tcMar>
+              <w:top w:type="dxa" w:w="90"/>
+              <w:left w:type="dxa" w:w="100"/>
+              <w:bottom w:type="dxa" w:w="90"/>
+              <w:right w:type="dxa" w:w="100"/>
+            </w:tcMar>
+          </w:tcPr>
+          <w:p>
+            <w:pPr>
+              <w:spacing w:after="40" w:before="0" w:line="260"/>
+            </w:pPr>
+            <w:r>
+              <w:rPr>
+                <w:rFonts w:ascii="Arial" w:cs="Arial" w:eastAsia="Microsoft YaHei" w:hAnsi="Arial"/>
+                <w:b w:val="false"/>
+                <w:bCs w:val="false"/>
+                <w:sz w:val="18"/>
+                <w:szCs w:val="18"/>
+              </w:rPr>
+              <w:t xml:space="preserve">不依赖</w:t>
+            </w:r>
+          </w:p>
+        </w:tc>
+        <w:tc>
+          <w:tcPr>
+            <w:tcW w:type="dxa" w:w="3846"/>
+            <w:tcBorders>
+              <w:top w:val="single" w:color="D5DBE3" w:sz="4"/>
+              <w:left w:val="single" w:color="D5DBE3" w:sz="4"/>
+              <w:bottom w:val="single" w:color="D5DBE3" w:sz="4"/>
+              <w:right w:val="single" w:color="D5DBE3" w:sz="4"/>
+            </w:tcBorders>
+            <w:shd w:fill="FFFFFF" w:val="clear"/>
+            <w:tcMar>
+              <w:top w:type="dxa" w:w="90"/>
+              <w:left w:type="dxa" w:w="100"/>
+              <w:bottom w:type="dxa" w:w="90"/>
+              <w:right w:type="dxa" w:w="100"/>
+            </w:tcMar>
+          </w:tcPr>
+          <w:p>
+            <w:pPr>
+              <w:spacing w:after="40" w:before="0" w:line="260"/>
+            </w:pPr>
+            <w:r>
+              <w:rPr>
+                <w:rFonts w:ascii="Arial" w:cs="Arial" w:eastAsia="Microsoft YaHei" w:hAnsi="Arial"/>
+                <w:b w:val="false"/>
+                <w:bCs w:val="false"/>
+                <w:sz w:val="18"/>
+                <w:szCs w:val="18"/>
+              </w:rPr>
+              <w:t xml:space="preserve">Copilot CLI、本人登录及所选执行模式</w:t>
+            </w:r>
+          </w:p>
+        </w:tc>
+      </w:tr>
+      <w:tr>
+        <w:trPr>
+          <w:cantSplit/>
+          <w:tblHeader w:val="false"/>
+        </w:trPr>
+        <w:tc>
+          <w:tcPr>
+            <w:tcW w:type="dxa" w:w="2350"/>
+            <w:tcBorders>
+              <w:top w:val="single" w:color="D5DBE3" w:sz="4"/>
+              <w:left w:val="single" w:color="D5DBE3" w:sz="4"/>
+              <w:bottom w:val="single" w:color="D5DBE3" w:sz="4"/>
+              <w:right w:val="single" w:color="D5DBE3" w:sz="4"/>
+            </w:tcBorders>
+            <w:shd w:fill="FFFFFF" w:val="clear"/>
+            <w:tcMar>
+              <w:top w:type="dxa" w:w="90"/>
+              <w:left w:type="dxa" w:w="100"/>
+              <w:bottom w:type="dxa" w:w="90"/>
+              <w:right w:type="dxa" w:w="100"/>
+            </w:tcMar>
+          </w:tcPr>
+          <w:p>
+            <w:pPr>
+              <w:spacing w:after="40" w:before="0" w:line="260"/>
+            </w:pPr>
+            <w:r>
+              <w:rPr>
+                <w:rFonts w:ascii="Arial" w:cs="Arial" w:eastAsia="Microsoft YaHei" w:hAnsi="Arial"/>
+                <w:b w:val="false"/>
+                <w:bCs w:val="false"/>
+                <w:sz w:val="18"/>
+                <w:szCs w:val="18"/>
+              </w:rPr>
+              <w:t xml:space="preserve">HSD 提取、咨询、只读共性分析 / Top IPS</w:t>
+            </w:r>
+          </w:p>
+        </w:tc>
+        <w:tc>
+          <w:tcPr>
+            <w:tcW w:type="dxa" w:w="3550"/>
+            <w:tcBorders>
+              <w:top w:val="single" w:color="D5DBE3" w:sz="4"/>
+              <w:left w:val="single" w:color="D5DBE3" w:sz="4"/>
+              <w:bottom w:val="single" w:color="D5DBE3" w:sz="4"/>
+              <w:right w:val="single" w:color="D5DBE3" w:sz="4"/>
+            </w:tcBorders>
+            <w:shd w:fill="FFFFFF" w:val="clear"/>
+            <w:tcMar>
+              <w:top w:type="dxa" w:w="90"/>
+              <w:left w:type="dxa" w:w="100"/>
+              <w:bottom w:type="dxa" w:w="90"/>
+              <w:right w:type="dxa" w:w="100"/>
+            </w:tcMar>
+          </w:tcPr>
+          <w:p>
+            <w:pPr>
+              <w:spacing w:after="40" w:before="0" w:line="260"/>
+            </w:pPr>
+            <w:r>
+              <w:rPr>
+                <w:rFonts w:ascii="Arial" w:cs="Arial" w:eastAsia="Microsoft YaHei" w:hAnsi="Arial"/>
+                <w:b w:val="false"/>
+                <w:bCs w:val="false"/>
+                <w:sz w:val="18"/>
+                <w:szCs w:val="18"/>
+              </w:rPr>
+              <w:t xml:space="preserve">不依赖</w:t>
+            </w:r>
+          </w:p>
+        </w:tc>
+        <w:tc>
+          <w:tcPr>
+            <w:tcW w:type="dxa" w:w="3846"/>
+            <w:tcBorders>
+              <w:top w:val="single" w:color="D5DBE3" w:sz="4"/>
+              <w:left w:val="single" w:color="D5DBE3" w:sz="4"/>
+              <w:bottom w:val="single" w:color="D5DBE3" w:sz="4"/>
+              <w:right w:val="single" w:color="D5DBE3" w:sz="4"/>
+            </w:tcBorders>
+            <w:shd w:fill="FFFFFF" w:val="clear"/>
+            <w:tcMar>
+              <w:top w:type="dxa" w:w="90"/>
+              <w:left w:type="dxa" w:w="100"/>
+              <w:bottom w:type="dxa" w:w="90"/>
+              <w:right w:type="dxa" w:w="100"/>
+            </w:tcMar>
+          </w:tcPr>
+          <w:p>
+            <w:pPr>
+              <w:spacing w:after="40" w:before="0" w:line="260"/>
+            </w:pPr>
+            <w:r>
+              <w:rPr>
+                <w:rFonts w:ascii="Arial" w:cs="Arial" w:eastAsia="Microsoft YaHei" w:hAnsi="Arial"/>
+                <w:b w:val="false"/>
+                <w:bCs w:val="false"/>
+                <w:sz w:val="18"/>
+                <w:szCs w:val="18"/>
+              </w:rPr>
+              <w:t xml:space="preserve">企业网络、HSD 权限；AI 分析另需 Copilot</w:t>
+            </w:r>
+          </w:p>
+        </w:tc>
+      </w:tr>
+      <w:tr>
+        <w:trPr>
+          <w:cantSplit/>
+          <w:tblHeader w:val="false"/>
+        </w:trPr>
+        <w:tc>
+          <w:tcPr>
+            <w:tcW w:type="dxa" w:w="2350"/>
+            <w:tcBorders>
+              <w:top w:val="single" w:color="D5DBE3" w:sz="4"/>
+              <w:left w:val="single" w:color="D5DBE3" w:sz="4"/>
+              <w:bottom w:val="single" w:color="D5DBE3" w:sz="4"/>
+              <w:right w:val="single" w:color="D5DBE3" w:sz="4"/>
+            </w:tcBorders>
+            <w:shd w:fill="FFFFFF" w:val="clear"/>
+            <w:tcMar>
+              <w:top w:type="dxa" w:w="90"/>
+              <w:left w:type="dxa" w:w="100"/>
+              <w:bottom w:type="dxa" w:w="90"/>
+              <w:right w:type="dxa" w:w="100"/>
+            </w:tcMar>
+          </w:tcPr>
+          <w:p>
+            <w:pPr>
+              <w:spacing w:after="40" w:before="0" w:line="260"/>
+            </w:pPr>
+            <w:r>
+              <w:rPr>
+                <w:rFonts w:ascii="Arial" w:cs="Arial" w:eastAsia="Microsoft YaHei" w:hAnsi="Arial"/>
+                <w:b w:val="false"/>
+                <w:bCs w:val="false"/>
+                <w:sz w:val="18"/>
+                <w:szCs w:val="18"/>
+              </w:rPr>
+              <w:t xml:space="preserve">查看历史报告</w:t>
+            </w:r>
+          </w:p>
+        </w:tc>
+        <w:tc>
+          <w:tcPr>
+            <w:tcW w:type="dxa" w:w="3550"/>
+            <w:tcBorders>
+              <w:top w:val="single" w:color="D5DBE3" w:sz="4"/>
+              <w:left w:val="single" w:color="D5DBE3" w:sz="4"/>
+              <w:bottom w:val="single" w:color="D5DBE3" w:sz="4"/>
+              <w:right w:val="single" w:color="D5DBE3" w:sz="4"/>
+            </w:tcBorders>
+            <w:shd w:fill="FFFFFF" w:val="clear"/>
+            <w:tcMar>
+              <w:top w:type="dxa" w:w="90"/>
+              <w:left w:type="dxa" w:w="100"/>
+              <w:bottom w:type="dxa" w:w="90"/>
+              <w:right w:type="dxa" w:w="100"/>
+            </w:tcMar>
+          </w:tcPr>
+          <w:p>
+            <w:pPr>
+              <w:spacing w:after="40" w:before="0" w:line="260"/>
+            </w:pPr>
+            <w:r>
+              <w:rPr>
+                <w:rFonts w:ascii="Arial" w:cs="Arial" w:eastAsia="Microsoft YaHei" w:hAnsi="Arial"/>
+                <w:b w:val="false"/>
+                <w:bCs w:val="false"/>
+                <w:sz w:val="18"/>
+                <w:szCs w:val="18"/>
+              </w:rPr>
+              <w:t xml:space="preserve">不依赖</w:t>
+            </w:r>
+          </w:p>
+        </w:tc>
+        <w:tc>
+          <w:tcPr>
+            <w:tcW w:type="dxa" w:w="3846"/>
+            <w:tcBorders>
+              <w:top w:val="single" w:color="D5DBE3" w:sz="4"/>
+              <w:left w:val="single" w:color="D5DBE3" w:sz="4"/>
+              <w:bottom w:val="single" w:color="D5DBE3" w:sz="4"/>
+              <w:right w:val="single" w:color="D5DBE3" w:sz="4"/>
+            </w:tcBorders>
+            <w:shd w:fill="FFFFFF" w:val="clear"/>
+            <w:tcMar>
+              <w:top w:type="dxa" w:w="90"/>
+              <w:left w:type="dxa" w:w="100"/>
+              <w:bottom w:type="dxa" w:w="90"/>
+              <w:right w:type="dxa" w:w="100"/>
+            </w:tcMar>
+          </w:tcPr>
+          <w:p>
+            <w:pPr>
+              <w:spacing w:after="40" w:before="0" w:line="260"/>
+            </w:pPr>
+            <w:r>
+              <w:rPr>
+                <w:rFonts w:ascii="Arial" w:cs="Arial" w:eastAsia="Microsoft YaHei" w:hAnsi="Arial"/>
+                <w:b w:val="false"/>
+                <w:bCs w:val="false"/>
+                <w:sz w:val="18"/>
+                <w:szCs w:val="18"/>
+              </w:rPr>
+              <w:t xml:space="preserve">单独迁移获准的报告和索引；Git 不包含 out 数据</w:t>
+            </w:r>
+          </w:p>
+        </w:tc>
+      </w:tr>
+      <w:tr>
+        <w:trPr>
+          <w:cantSplit/>
+          <w:tblHeader w:val="false"/>
+        </w:trPr>
+        <w:tc>
+          <w:tcPr>
+            <w:tcW w:type="dxa" w:w="2350"/>
+            <w:tcBorders>
+              <w:top w:val="single" w:color="D5DBE3" w:sz="4"/>
+              <w:left w:val="single" w:color="D5DBE3" w:sz="4"/>
+              <w:bottom w:val="single" w:color="D5DBE3" w:sz="4"/>
+              <w:right w:val="single" w:color="D5DBE3" w:sz="4"/>
+            </w:tcBorders>
+            <w:shd w:fill="FFFFFF" w:val="clear"/>
+            <w:tcMar>
+              <w:top w:type="dxa" w:w="90"/>
+              <w:left w:type="dxa" w:w="100"/>
+              <w:bottom w:type="dxa" w:w="90"/>
+              <w:right w:type="dxa" w:w="100"/>
+            </w:tcMar>
+          </w:tcPr>
+          <w:p>
+            <w:pPr>
+              <w:spacing w:after="40" w:before="0" w:line="260"/>
+            </w:pPr>
+            <w:r>
+              <w:rPr>
+                <w:rFonts w:ascii="Arial" w:cs="Arial" w:eastAsia="Microsoft YaHei" w:hAnsi="Arial"/>
+                <w:b w:val="false"/>
+                <w:bCs w:val="false"/>
+                <w:sz w:val="18"/>
+                <w:szCs w:val="18"/>
+              </w:rPr>
+              <w:t xml:space="preserve">Outlook 草稿 / 通知</w:t>
+            </w:r>
+          </w:p>
+        </w:tc>
+        <w:tc>
+          <w:tcPr>
+            <w:tcW w:type="dxa" w:w="3550"/>
+            <w:tcBorders>
+              <w:top w:val="single" w:color="D5DBE3" w:sz="4"/>
+              <w:left w:val="single" w:color="D5DBE3" w:sz="4"/>
+              <w:bottom w:val="single" w:color="D5DBE3" w:sz="4"/>
+              <w:right w:val="single" w:color="D5DBE3" w:sz="4"/>
+            </w:tcBorders>
+            <w:shd w:fill="FFFFFF" w:val="clear"/>
+            <w:tcMar>
+              <w:top w:type="dxa" w:w="90"/>
+              <w:left w:type="dxa" w:w="100"/>
+              <w:bottom w:type="dxa" w:w="90"/>
+              <w:right w:type="dxa" w:w="100"/>
+            </w:tcMar>
+          </w:tcPr>
+          <w:p>
+            <w:pPr>
+              <w:spacing w:after="40" w:before="0" w:line="260"/>
+            </w:pPr>
+            <w:r>
+              <w:rPr>
+                <w:rFonts w:ascii="Arial" w:cs="Arial" w:eastAsia="Microsoft YaHei" w:hAnsi="Arial"/>
+                <w:b w:val="false"/>
+                <w:bCs w:val="false"/>
+                <w:sz w:val="18"/>
+                <w:szCs w:val="18"/>
+              </w:rPr>
+              <w:t xml:space="preserve">不依赖</w:t>
+            </w:r>
+          </w:p>
+        </w:tc>
+        <w:tc>
+          <w:tcPr>
+            <w:tcW w:type="dxa" w:w="3846"/>
+            <w:tcBorders>
+              <w:top w:val="single" w:color="D5DBE3" w:sz="4"/>
+              <w:left w:val="single" w:color="D5DBE3" w:sz="4"/>
+              <w:bottom w:val="single" w:color="D5DBE3" w:sz="4"/>
+              <w:right w:val="single" w:color="D5DBE3" w:sz="4"/>
+            </w:tcBorders>
+            <w:shd w:fill="FFFFFF" w:val="clear"/>
+            <w:tcMar>
+              <w:top w:type="dxa" w:w="90"/>
+              <w:left w:type="dxa" w:w="100"/>
+              <w:bottom w:type="dxa" w:w="90"/>
+              <w:right w:type="dxa" w:w="100"/>
+            </w:tcMar>
+          </w:tcPr>
+          <w:p>
+            <w:pPr>
+              <w:spacing w:after="40" w:before="0" w:line="260"/>
+            </w:pPr>
+            <w:r>
+              <w:rPr>
+                <w:rFonts w:ascii="Arial" w:cs="Arial" w:eastAsia="Microsoft YaHei" w:hAnsi="Arial"/>
+                <w:b w:val="false"/>
+                <w:bCs w:val="false"/>
+                <w:sz w:val="18"/>
+                <w:szCs w:val="18"/>
+              </w:rPr>
+              <w:t xml:space="preserve">当前 Windows 用户的 Outlook 与邮箱配置</w:t>
+            </w:r>
+          </w:p>
+        </w:tc>
+      </w:tr>
+      <w:tr>
+        <w:trPr>
+          <w:cantSplit/>
+          <w:tblHeader w:val="false"/>
+        </w:trPr>
+        <w:tc>
+          <w:tcPr>
+            <w:tcW w:type="dxa" w:w="2350"/>
+            <w:tcBorders>
+              <w:top w:val="single" w:color="D5DBE3" w:sz="4"/>
+              <w:left w:val="single" w:color="D5DBE3" w:sz="4"/>
+              <w:bottom w:val="single" w:color="D5DBE3" w:sz="4"/>
+              <w:right w:val="single" w:color="D5DBE3" w:sz="4"/>
+            </w:tcBorders>
+            <w:shd w:fill="FFFFFF" w:val="clear"/>
+            <w:tcMar>
+              <w:top w:type="dxa" w:w="90"/>
+              <w:left w:type="dxa" w:w="100"/>
+              <w:bottom w:type="dxa" w:w="90"/>
+              <w:right w:type="dxa" w:w="100"/>
+            </w:tcMar>
+          </w:tcPr>
+          <w:p>
+            <w:pPr>
+              <w:spacing w:after="40" w:before="0" w:line="260"/>
+            </w:pPr>
+            <w:r>
+              <w:rPr>
+                <w:rFonts w:ascii="Arial" w:cs="Arial" w:eastAsia="Microsoft YaHei" w:hAnsi="Arial"/>
+                <w:b w:val="false"/>
+                <w:bCs w:val="false"/>
+                <w:sz w:val="18"/>
+                <w:szCs w:val="18"/>
+              </w:rPr>
+              <w:t xml:space="preserve">远端设备预检、烧录、电源、串口和 MLC</w:t>
+            </w:r>
+          </w:p>
+        </w:tc>
+        <w:tc>
+          <w:tcPr>
+            <w:tcW w:type="dxa" w:w="3550"/>
+            <w:tcBorders>
+              <w:top w:val="single" w:color="D5DBE3" w:sz="4"/>
+              <w:left w:val="single" w:color="D5DBE3" w:sz="4"/>
+              <w:bottom w:val="single" w:color="D5DBE3" w:sz="4"/>
+              <w:right w:val="single" w:color="D5DBE3" w:sz="4"/>
+            </w:tcBorders>
+            <w:shd w:fill="FFFFFF" w:val="clear"/>
+            <w:tcMar>
+              <w:top w:type="dxa" w:w="90"/>
+              <w:left w:type="dxa" w:w="100"/>
+              <w:bottom w:type="dxa" w:w="90"/>
+              <w:right w:type="dxa" w:w="100"/>
+            </w:tcMar>
+          </w:tcPr>
+          <w:p>
+            <w:pPr>
+              <w:spacing w:after="40" w:before="0" w:line="260"/>
+            </w:pPr>
+            <w:r>
+              <w:rPr>
+                <w:rFonts w:ascii="Arial" w:cs="Arial" w:eastAsia="Microsoft YaHei" w:hAnsi="Arial"/>
+                <w:b w:val="false"/>
+                <w:bCs w:val="false"/>
+                <w:sz w:val="18"/>
+                <w:szCs w:val="18"/>
+              </w:rPr>
+              <w:t xml:space="preserve">依赖</w:t>
+            </w:r>
+          </w:p>
+        </w:tc>
+        <w:tc>
+          <w:tcPr>
+            <w:tcW w:type="dxa" w:w="3846"/>
+            <w:tcBorders>
+              <w:top w:val="single" w:color="D5DBE3" w:sz="4"/>
+              <w:left w:val="single" w:color="D5DBE3" w:sz="4"/>
+              <w:bottom w:val="single" w:color="D5DBE3" w:sz="4"/>
+              <w:right w:val="single" w:color="D5DBE3" w:sz="4"/>
+            </w:tcBorders>
+            <w:shd w:fill="FFFFFF" w:val="clear"/>
+            <w:tcMar>
+              <w:top w:type="dxa" w:w="90"/>
+              <w:left w:type="dxa" w:w="100"/>
+              <w:bottom w:type="dxa" w:w="90"/>
+              <w:right w:type="dxa" w:w="100"/>
+            </w:tcMar>
+          </w:tcPr>
+          <w:p>
+            <w:pPr>
+              <w:spacing w:after="40" w:before="0" w:line="260"/>
+            </w:pPr>
+            <w:r>
+              <w:rPr>
+                <w:rFonts w:ascii="Arial" w:cs="Arial" w:eastAsia="Microsoft YaHei" w:hAnsi="Arial"/>
+                <w:b w:val="false"/>
+                <w:bCs w:val="false"/>
+                <w:sz w:val="18"/>
+                <w:szCs w:val="18"/>
+              </w:rPr>
+              <w:t xml:space="preserve">新电脑 SSH 身份、控制机授权、网络、主机信任和硬件配置</w:t>
+            </w:r>
+          </w:p>
+        </w:tc>
+      </w:tr>
+      <w:tr>
+        <w:trPr>
+          <w:cantSplit/>
+          <w:tblHeader w:val="false"/>
+        </w:trPr>
+        <w:tc>
+          <w:tcPr>
+            <w:tcW w:type="dxa" w:w="2350"/>
+            <w:tcBorders>
+              <w:top w:val="single" w:color="D5DBE3" w:sz="4"/>
+              <w:left w:val="single" w:color="D5DBE3" w:sz="4"/>
+              <w:bottom w:val="single" w:color="D5DBE3" w:sz="4"/>
+              <w:right w:val="single" w:color="D5DBE3" w:sz="4"/>
+            </w:tcBorders>
+            <w:shd w:fill="FFFFFF" w:val="clear"/>
+            <w:tcMar>
+              <w:top w:type="dxa" w:w="90"/>
+              <w:left w:type="dxa" w:w="100"/>
+              <w:bottom w:type="dxa" w:w="90"/>
+              <w:right w:type="dxa" w:w="100"/>
+            </w:tcMar>
+          </w:tcPr>
+          <w:p>
+            <w:pPr>
+              <w:spacing w:after="40" w:before="0" w:line="260"/>
+            </w:pPr>
+            <w:r>
+              <w:rPr>
+                <w:rFonts w:ascii="Arial" w:cs="Arial" w:eastAsia="Microsoft YaHei" w:hAnsi="Arial"/>
+                <w:b w:val="false"/>
+                <w:bCs w:val="false"/>
+                <w:sz w:val="18"/>
+                <w:szCs w:val="18"/>
+              </w:rPr>
+              <w:t xml:space="preserve">包含 Open IPS 硬件 Debug 的自动 Query</w:t>
+            </w:r>
+          </w:p>
+        </w:tc>
+        <w:tc>
+          <w:tcPr>
+            <w:tcW w:type="dxa" w:w="3550"/>
+            <w:tcBorders>
+              <w:top w:val="single" w:color="D5DBE3" w:sz="4"/>
+              <w:left w:val="single" w:color="D5DBE3" w:sz="4"/>
+              <w:bottom w:val="single" w:color="D5DBE3" w:sz="4"/>
+              <w:right w:val="single" w:color="D5DBE3" w:sz="4"/>
+            </w:tcBorders>
+            <w:shd w:fill="FFFFFF" w:val="clear"/>
+            <w:tcMar>
+              <w:top w:type="dxa" w:w="90"/>
+              <w:left w:type="dxa" w:w="100"/>
+              <w:bottom w:type="dxa" w:w="90"/>
+              <w:right w:type="dxa" w:w="100"/>
+            </w:tcMar>
+          </w:tcPr>
+          <w:p>
+            <w:pPr>
+              <w:spacing w:after="40" w:before="0" w:line="260"/>
+            </w:pPr>
+            <w:r>
+              <w:rPr>
+                <w:rFonts w:ascii="Arial" w:cs="Arial" w:eastAsia="Microsoft YaHei" w:hAnsi="Arial"/>
+                <w:b w:val="false"/>
+                <w:bCs w:val="false"/>
+                <w:sz w:val="18"/>
+                <w:szCs w:val="18"/>
+              </w:rPr>
+              <w:t xml:space="preserve">硬件步骤依赖</w:t>
+            </w:r>
+          </w:p>
+        </w:tc>
+        <w:tc>
+          <w:tcPr>
+            <w:tcW w:type="dxa" w:w="3846"/>
+            <w:tcBorders>
+              <w:top w:val="single" w:color="D5DBE3" w:sz="4"/>
+              <w:left w:val="single" w:color="D5DBE3" w:sz="4"/>
+              <w:bottom w:val="single" w:color="D5DBE3" w:sz="4"/>
+              <w:right w:val="single" w:color="D5DBE3" w:sz="4"/>
+            </w:tcBorders>
+            <w:shd w:fill="FFFFFF" w:val="clear"/>
+            <w:tcMar>
+              <w:top w:type="dxa" w:w="90"/>
+              <w:left w:type="dxa" w:w="100"/>
+              <w:bottom w:type="dxa" w:w="90"/>
+              <w:right w:type="dxa" w:w="100"/>
+            </w:tcMar>
+          </w:tcPr>
+          <w:p>
+            <w:pPr>
+              <w:spacing w:after="40" w:before="0" w:line="260"/>
+            </w:pPr>
+            <w:r>
+              <w:rPr>
+                <w:rFonts w:ascii="Arial" w:cs="Arial" w:eastAsia="Microsoft YaHei" w:hAnsi="Arial"/>
+                <w:b w:val="false"/>
+                <w:bCs w:val="false"/>
+                <w:sz w:val="18"/>
+                <w:szCs w:val="18"/>
+              </w:rPr>
+              <w:t xml:space="preserve">除 Query 所需身份外，还需完成 SSH 和硬件前置条件</w:t>
+            </w:r>
+          </w:p>
+        </w:tc>
+      </w:tr>
+    </w:tbl>
+    <w:p>
+      <w:pPr>
+        <w:spacing w:after="60"/>
+      </w:pPr>
+    </w:p>
+    <w:p>
+      <w:pPr>
+        <w:spacing w:after="120" w:line="300"/>
+      </w:pPr>
+      <w:r>
+        <w:rPr>
+          <w:rFonts w:ascii="Arial" w:cs="Arial" w:eastAsia="Microsoft YaHei" w:hAnsi="Arial"/>
+        </w:rPr>
+        <w:t xml:space="preserve">因此，没有 SSH 配置时可以先开展已具备前提的非硬件功能；不要通过提交一次 Debug 来“顺便测试 SSH”。SSH 就绪也只代表远程连接成立，不代表 EM100、PowerSplitter、串口、镜像或 MLC 已可用。</w:t>
+      </w:r>
+    </w:p>
+    <w:p>
+      <w:pPr>
+        <w:spacing w:after="120" w:line="300"/>
+      </w:pPr>
+      <w:r>
+        <w:rPr>
+          <w:rFonts w:ascii="Arial" w:cs="Arial" w:eastAsia="Microsoft YaHei" w:hAnsi="Arial"/>
+        </w:rPr>
+        <w:t xml:space="preserve">对本次 GitHub 脱敏交付分支，UI 模板提供的是不可用于上机的示例机器清单。首次部署时，另将 config\lab-machine-inventory.template.json 复制到已忽略的 config\lab-machine-inventory.json，填写批准的真实机器，并在本地 UI 配置中将 machineMatching.inventoryPath 改为 config\\lab-machine-inventory.json。这一步登记机器，但不会生成 SSH 密钥或授予服务器权限。</w:t>
+      </w:r>
+    </w:p>
+    <w:p>
+      <w:pPr>
+        <w:pStyle w:val="Heading2"/>
+        <w:keepNext/>
+      </w:pPr>
+      <w:r>
+        <w:rPr>
+          <w:rFonts w:ascii="Arial" w:cs="Arial" w:eastAsia="Microsoft YaHei" w:hAnsi="Arial"/>
+        </w:rPr>
+        <w:t xml:space="preserve">6.5 新电脑首次 SSH 配置与验收</w:t>
+      </w:r>
+    </w:p>
+    <w:p>
+      <w:pPr>
+        <w:spacing w:after="120" w:line="300"/>
+      </w:pPr>
+      <w:r>
+        <w:rPr>
+          <w:rFonts w:ascii="Arial" w:cs="Arial" w:eastAsia="Microsoft YaHei" w:hAnsi="Arial"/>
+        </w:rPr>
+        <w:t xml:space="preserve">以下是供接收人和控制机管理员执行的配置说明，本次更新文档不执行这些操作。连接对象通常是安装 EM100 / PowerSplitter 工具的 Windows 控制机，并非默认直连被测 Linux Host OS。先确认获准的控制机地址、登录账号、网络/VPN、资源负责人和 SSH 端口。当前核心包装默认使用端口 22；不能只在 JSON 随意添加 ssh.port 就假定所有 SSH/SCP 脚本支持非默认端口。</w:t>
+      </w:r>
+    </w:p>
+    <w:p>
+      <w:pPr>
+        <w:spacing w:after="120" w:line="300"/>
+      </w:pPr>
+      <w:r>
+        <w:rPr>
+          <w:rFonts w:ascii="Arial" w:cs="Arial" w:eastAsia="Microsoft YaHei" w:hAnsi="Arial"/>
+        </w:rPr>
+        <w:t xml:space="preserve">步骤一：新电脑安装或确认 OpenSSH Client。</w:t>
+      </w:r>
+    </w:p>
+    <w:p>
+      <w:pPr>
+        <w:spacing w:after="120" w:line="300"/>
+      </w:pPr>
+      <w:r>
+        <w:rPr>
+          <w:rFonts w:ascii="Arial" w:cs="Arial" w:eastAsia="Microsoft YaHei" w:hAnsi="Arial"/>
+        </w:rPr>
+        <w:t xml:space="preserve">在新电脑 PowerShell 中检查：</w:t>
+      </w:r>
+    </w:p>
+    <w:p>
+      <w:pPr>
+        <w:shd w:fill="F2F4F7" w:val="clear"/>
+        <w:spacing w:after="20" w:before="0" w:line="240"/>
+      </w:pPr>
+      <w:r>
+        <w:rPr>
+          <w:rFonts w:ascii="Consolas" w:cs="Consolas" w:eastAsia="Microsoft YaHei" w:hAnsi="Consolas"/>
+          <w:sz w:val="17"/>
+          <w:szCs w:val="17"/>
+        </w:rPr>
+        <w:t xml:space="preserve">Get-Command ssh, scp, ssh-keygen, ssh-add</w:t>
+      </w:r>
+    </w:p>
+    <w:p>
+      <w:pPr>
+        <w:shd w:fill="F2F4F7" w:val="clear"/>
+        <w:spacing w:after="20" w:before="0" w:line="240"/>
+      </w:pPr>
+      <w:r>
+        <w:rPr>
+          <w:rFonts w:ascii="Consolas" w:cs="Consolas" w:eastAsia="Microsoft YaHei" w:hAnsi="Consolas"/>
+          <w:sz w:val="17"/>
+          <w:szCs w:val="17"/>
+        </w:rPr>
+        <w:t xml:space="preserve">ssh -V</w:t>
+      </w:r>
+    </w:p>
+    <w:p>
+      <w:pPr>
+        <w:spacing w:after="120" w:line="300"/>
+      </w:pPr>
+      <w:r>
+        <w:rPr>
+          <w:rFonts w:ascii="Arial" w:cs="Arial" w:eastAsia="Microsoft YaHei" w:hAnsi="Arial"/>
+        </w:rPr>
+        <w:t xml:space="preserve">未安装时，由 IT 或获准管理员在新电脑的管理员 PowerShell 中安装 Windows 可选组件：</w:t>
+      </w:r>
+    </w:p>
+    <w:p>
+      <w:pPr>
+        <w:shd w:fill="F2F4F7" w:val="clear"/>
+        <w:spacing w:after="20" w:before="0" w:line="240"/>
+      </w:pPr>
+      <w:r>
+        <w:rPr>
+          <w:rFonts w:ascii="Consolas" w:cs="Consolas" w:eastAsia="Microsoft YaHei" w:hAnsi="Consolas"/>
+          <w:sz w:val="17"/>
+          <w:szCs w:val="17"/>
+        </w:rPr>
+        <w:t xml:space="preserve">Get-WindowsCapability -Online -Name OpenSSH.Client~~~~0.0.1.0</w:t>
+      </w:r>
+    </w:p>
+    <w:p>
+      <w:pPr>
+        <w:shd w:fill="F2F4F7" w:val="clear"/>
+        <w:spacing w:after="20" w:before="0" w:line="240"/>
+      </w:pPr>
+      <w:r>
+        <w:rPr>
+          <w:rFonts w:ascii="Consolas" w:cs="Consolas" w:eastAsia="Microsoft YaHei" w:hAnsi="Consolas"/>
+          <w:sz w:val="17"/>
+          <w:szCs w:val="17"/>
+        </w:rPr>
+        <w:t xml:space="preserve">Add-WindowsCapability -Online -Name OpenSSH.Client~~~~0.0.1.0</w:t>
+      </w:r>
+    </w:p>
+    <w:p>
+      <w:pPr>
+        <w:spacing w:after="120" w:line="300"/>
+      </w:pPr>
+      <w:r>
+        <w:rPr>
+          <w:rFonts w:ascii="Arial" w:cs="Arial" w:eastAsia="Microsoft YaHei" w:hAnsi="Arial"/>
+        </w:rPr>
+        <w:t xml:space="preserve">安装完成后重新打开终端。新电脑只作为客户端时，不需要为此启用 OpenSSH Server。若同时安装了 Git 自带 SSH，确认终端与 UI 子进程使用同一套批准的 OpenSSH；不同实现可能无法复用同一 ssh-agent。</w:t>
+      </w:r>
+    </w:p>
+    <w:p>
+      <w:pPr>
+        <w:spacing w:after="120" w:line="300"/>
+      </w:pPr>
+      <w:r>
+        <w:rPr>
+          <w:rFonts w:ascii="Arial" w:cs="Arial" w:eastAsia="Microsoft YaHei" w:hAnsi="Arial"/>
+        </w:rPr>
+        <w:t xml:space="preserve">步骤二：接收人在自己的 Windows 账号下生成专用密钥。</w:t>
+      </w:r>
+    </w:p>
+    <w:p>
+      <w:pPr>
+        <w:shd w:fill="F2F4F7" w:val="clear"/>
+        <w:spacing w:after="20" w:before="0" w:line="240"/>
+      </w:pPr>
+      <w:r>
+        <w:rPr>
+          <w:rFonts w:ascii="Consolas" w:cs="Consolas" w:eastAsia="Microsoft YaHei" w:hAnsi="Consolas"/>
+          <w:sz w:val="17"/>
+          <w:szCs w:val="17"/>
+        </w:rPr>
+        <w:t xml:space="preserve">New-Item -ItemType Directory -Path "$HOME\.ssh" -Force</w:t>
+      </w:r>
+    </w:p>
+    <w:p>
+      <w:pPr>
+        <w:shd w:fill="F2F4F7" w:val="clear"/>
+        <w:spacing w:after="20" w:before="0" w:line="240"/>
+      </w:pPr>
+      <w:r>
+        <w:rPr>
+          <w:rFonts w:ascii="Consolas" w:cs="Consolas" w:eastAsia="Microsoft YaHei" w:hAnsi="Consolas"/>
+          <w:sz w:val="17"/>
+          <w:szCs w:val="17"/>
+        </w:rPr>
+        <w:t xml:space="preserve">$keyPath = Join-Path $HOME '.ssh\hardware_flow_ed25519'</w:t>
+      </w:r>
+    </w:p>
+    <w:p>
+      <w:pPr>
+        <w:shd w:fill="F2F4F7" w:val="clear"/>
+        <w:spacing w:after="20" w:before="0" w:line="240"/>
+      </w:pPr>
+      <w:r>
+        <w:rPr>
+          <w:rFonts w:ascii="Consolas" w:cs="Consolas" w:eastAsia="Microsoft YaHei" w:hAnsi="Consolas"/>
+          <w:sz w:val="17"/>
+          <w:szCs w:val="17"/>
+        </w:rPr>
+        <w:t xml:space="preserve">if ((Test-Path $keyPath) -or (Test-Path "$keyPath.pub")) {</w:t>
+      </w:r>
+    </w:p>
+    <w:p>
+      <w:pPr>
+        <w:shd w:fill="F2F4F7" w:val="clear"/>
+        <w:spacing w:after="20" w:before="0" w:line="240"/>
+      </w:pPr>
+      <w:r>
+        <w:rPr>
+          <w:rFonts w:ascii="Consolas" w:cs="Consolas" w:eastAsia="Microsoft YaHei" w:hAnsi="Consolas"/>
+          <w:sz w:val="17"/>
+          <w:szCs w:val="17"/>
+        </w:rPr>
+        <w:t xml:space="preserve">    throw 'Key file already exists; do not overwrite it.'</w:t>
+      </w:r>
+    </w:p>
+    <w:p>
+      <w:pPr>
+        <w:shd w:fill="F2F4F7" w:val="clear"/>
+        <w:spacing w:after="20" w:before="0" w:line="240"/>
+      </w:pPr>
+      <w:r>
+        <w:rPr>
+          <w:rFonts w:ascii="Consolas" w:cs="Consolas" w:eastAsia="Microsoft YaHei" w:hAnsi="Consolas"/>
+          <w:sz w:val="17"/>
+          <w:szCs w:val="17"/>
+        </w:rPr>
+        <w:t xml:space="preserve">}</w:t>
+      </w:r>
+    </w:p>
+    <w:p>
+      <w:pPr>
+        <w:shd w:fill="F2F4F7" w:val="clear"/>
+        <w:spacing w:after="20" w:before="0" w:line="240"/>
+      </w:pPr>
+      <w:r>
+        <w:rPr>
+          <w:rFonts w:ascii="Consolas" w:cs="Consolas" w:eastAsia="Microsoft YaHei" w:hAnsi="Consolas"/>
+          <w:sz w:val="17"/>
+          <w:szCs w:val="17"/>
+        </w:rPr>
+        <w:t xml:space="preserve">ssh-keygen -t ed25519 -a 64 -f $keyPath</w:t>
+      </w:r>
+    </w:p>
+    <w:p>
+      <w:pPr>
+        <w:spacing w:after="120" w:line="300"/>
+      </w:pPr>
+      <w:r>
+        <w:rPr>
+          <w:rFonts w:ascii="Arial" w:cs="Arial" w:eastAsia="Microsoft YaHei" w:hAnsi="Arial"/>
+        </w:rPr>
+        <w:t xml:space="preserve">按本机交互提示设置密钥保护口令，不写入命令参数、脚本、Git 或聊天。如果企业政策不允许 Ed25519，由 IT 指定获准算法，不绕过策略。无扩展名文件是私钥，仅留在接收人的受控本机目录；.pub 文件是公钥，可通过批准渠道交给控制机管理员。不得把私钥当作附件发送。</w:t>
+      </w:r>
+    </w:p>
+    <w:p>
+      <w:pPr>
+        <w:spacing w:after="120" w:line="300"/>
+      </w:pPr>
+      <w:r>
+        <w:rPr>
+          <w:rFonts w:ascii="Arial" w:cs="Arial" w:eastAsia="Microsoft YaHei" w:hAnsi="Arial"/>
+        </w:rPr>
+        <w:t xml:space="preserve">脚本使用 BatchMode=yes，不会等待输入登录密码或私钥保护口令。对于有保护口令的密钥，应使用批准的 ssh-agent：由管理员按策略启用服务，再由实际运行 UI 的用户装载密钥。</w:t>
+      </w:r>
+    </w:p>
+    <w:p>
+      <w:pPr>
+        <w:shd w:fill="F2F4F7" w:val="clear"/>
+        <w:spacing w:after="20" w:before="0" w:line="240"/>
+      </w:pPr>
+      <w:r>
+        <w:rPr>
+          <w:rFonts w:ascii="Consolas" w:cs="Consolas" w:eastAsia="Microsoft YaHei" w:hAnsi="Consolas"/>
+          <w:sz w:val="17"/>
+          <w:szCs w:val="17"/>
+        </w:rPr>
+        <w:t xml:space="preserve"># 新电脑：仅由获准管理员配置服务</w:t>
+      </w:r>
+    </w:p>
+    <w:p>
+      <w:pPr>
+        <w:shd w:fill="F2F4F7" w:val="clear"/>
+        <w:spacing w:after="20" w:before="0" w:line="240"/>
+      </w:pPr>
+      <w:r>
+        <w:rPr>
+          <w:rFonts w:ascii="Consolas" w:cs="Consolas" w:eastAsia="Microsoft YaHei" w:hAnsi="Consolas"/>
+          <w:sz w:val="17"/>
+          <w:szCs w:val="17"/>
+        </w:rPr>
+        <w:t xml:space="preserve">Set-Service -Name ssh-agent -StartupType Automatic</w:t>
+      </w:r>
+    </w:p>
+    <w:p>
+      <w:pPr>
+        <w:shd w:fill="F2F4F7" w:val="clear"/>
+        <w:spacing w:after="20" w:before="0" w:line="240"/>
+      </w:pPr>
+      <w:r>
+        <w:rPr>
+          <w:rFonts w:ascii="Consolas" w:cs="Consolas" w:eastAsia="Microsoft YaHei" w:hAnsi="Consolas"/>
+          <w:sz w:val="17"/>
+          <w:szCs w:val="17"/>
+        </w:rPr>
+        <w:t xml:space="preserve">Start-Service ssh-agent</w:t>
+      </w:r>
+    </w:p>
+    <w:p>
+      <w:pPr>
+        <w:shd w:fill="F2F4F7" w:val="clear"/>
+        <w:spacing w:after="20" w:before="0" w:line="240"/>
+      </w:pPr>
+      <w:r>
+        <w:rPr>
+          <w:rFonts w:ascii="Consolas" w:cs="Consolas" w:eastAsia="Microsoft YaHei" w:hAnsi="Consolas"/>
+          <w:sz w:val="17"/>
+          <w:szCs w:val="17"/>
+        </w:rPr>
+        <w:t xml:space="preserve"># 新电脑：回到接收人自己的普通 PowerShell</w:t>
+      </w:r>
+    </w:p>
+    <w:p>
+      <w:pPr>
+        <w:shd w:fill="F2F4F7" w:val="clear"/>
+        <w:spacing w:after="20" w:before="0" w:line="240"/>
+      </w:pPr>
+      <w:r>
+        <w:rPr>
+          <w:rFonts w:ascii="Consolas" w:cs="Consolas" w:eastAsia="Microsoft YaHei" w:hAnsi="Consolas"/>
+          <w:sz w:val="17"/>
+          <w:szCs w:val="17"/>
+        </w:rPr>
+        <w:t xml:space="preserve">ssh-add "$HOME\.ssh\hardware_flow_ed25519"</w:t>
+      </w:r>
+    </w:p>
+    <w:p>
+      <w:pPr>
+        <w:shd w:fill="F2F4F7" w:val="clear"/>
+        <w:spacing w:after="20" w:before="0" w:line="240"/>
+      </w:pPr>
+      <w:r>
+        <w:rPr>
+          <w:rFonts w:ascii="Consolas" w:cs="Consolas" w:eastAsia="Microsoft YaHei" w:hAnsi="Consolas"/>
+          <w:sz w:val="17"/>
+          <w:szCs w:val="17"/>
+        </w:rPr>
+        <w:t xml:space="preserve">ssh-add -l</w:t>
+      </w:r>
+    </w:p>
+    <w:p>
+      <w:pPr>
+        <w:spacing w:after="120" w:line="300"/>
+      </w:pPr>
+      <w:r>
+        <w:rPr>
+          <w:rFonts w:ascii="Arial" w:cs="Arial" w:eastAsia="Microsoft YaHei" w:hAnsi="Arial"/>
+        </w:rPr>
+        <w:t xml:space="preserve">只在本机提示框输入保护口令。UI、命令行和 agent 应使用同一 Windows 用户身份；换账号、用另一管理员账号启动 UI、迁移电脑或重启后，应重新确认密钥是否可用。不要为图方便关闭密钥保护或把 agent 转发给远端。</w:t>
+      </w:r>
+    </w:p>
+    <w:p>
+      <w:pPr>
+        <w:spacing w:after="120" w:line="300"/>
+      </w:pPr>
+      <w:r>
+        <w:rPr>
+          <w:rFonts w:ascii="Arial" w:cs="Arial" w:eastAsia="Microsoft YaHei" w:hAnsi="Arial"/>
+        </w:rPr>
+        <w:t xml:space="preserve">步骤三：控制机管理员安装公钥并核对服务端。</w:t>
+      </w:r>
+    </w:p>
+    <w:p>
+      <w:pPr>
+        <w:spacing w:after="120" w:line="300"/>
+      </w:pPr>
+      <w:r>
+        <w:rPr>
+          <w:rFonts w:ascii="Arial" w:cs="Arial" w:eastAsia="Microsoft YaHei" w:hAnsi="Arial"/>
+        </w:rPr>
+        <w:t xml:space="preserve">管理员先确认目标控制机已有 OpenSSH Server、sshd 服务和正确登录账号，且防火墙只向批准的来源网络开放。已有共享控制机不要擅自重装或重启 SSH 服务；尚未部署时由 IT 安装 OpenSSH.Server 可选组件并按企业流程配置服务和访问规则。</w:t>
+      </w:r>
+    </w:p>
+    <w:p>
+      <w:pPr>
+        <w:spacing w:after="120" w:line="300"/>
+      </w:pPr>
+      <w:r>
+        <w:rPr>
+          <w:rFonts w:ascii="Arial" w:cs="Arial" w:eastAsia="Microsoft YaHei" w:hAnsi="Arial"/>
+        </w:rPr>
+        <w:t xml:space="preserve">公钥要授权给“将要登录的那个远端账号”，不能只放在管理员自己的目录。Windows OpenSSH 常见位置如下，最终以实际 sshd_config 的有效规则为准：</w:t>
+      </w:r>
+    </w:p>
+    <w:tbl>
+      <w:tblPr>
+        <w:tblW w:type="dxa" w:w="9746"/>
+        <w:tblBorders>
+          <w:top w:val="single" w:color="auto" w:sz="4"/>
+          <w:left w:val="single" w:color="auto" w:sz="4"/>
+          <w:bottom w:val="single" w:color="auto" w:sz="4"/>
+          <w:right w:val="single" w:color="auto" w:sz="4"/>
+          <w:insideH w:val="single" w:color="auto" w:sz="4"/>
+          <w:insideV w:val="single" w:color="auto" w:sz="4"/>
+        </w:tblBorders>
+      </w:tblPr>
+      <w:tblGrid>
+        <w:gridCol w:w="2350"/>
+        <w:gridCol w:w="3550"/>
+        <w:gridCol w:w="3846"/>
+      </w:tblGrid>
+      <w:tr>
+        <w:trPr>
+          <w:cantSplit/>
+          <w:tblHeader/>
+        </w:trPr>
+        <w:tc>
+          <w:tcPr>
+            <w:tcW w:type="dxa" w:w="2350"/>
+            <w:tcBorders>
+              <w:top w:val="single" w:color="D5DBE3" w:sz="4"/>
+              <w:left w:val="single" w:color="D5DBE3" w:sz="4"/>
+              <w:bottom w:val="single" w:color="D5DBE3" w:sz="4"/>
+              <w:right w:val="single" w:color="D5DBE3" w:sz="4"/>
+            </w:tcBorders>
+            <w:shd w:fill="E8EEF5" w:val="clear"/>
+            <w:tcMar>
+              <w:top w:type="dxa" w:w="90"/>
+              <w:left w:type="dxa" w:w="100"/>
+              <w:bottom w:type="dxa" w:w="90"/>
+              <w:right w:type="dxa" w:w="100"/>
+            </w:tcMar>
+          </w:tcPr>
+          <w:p>
+            <w:pPr>
+              <w:spacing w:after="40" w:before="0" w:line="260"/>
+            </w:pPr>
+            <w:r>
+              <w:rPr>
+                <w:rFonts w:ascii="Arial" w:cs="Arial" w:eastAsia="Microsoft YaHei" w:hAnsi="Arial"/>
+                <w:b/>
+                <w:bCs/>
+                <w:sz w:val="18"/>
+                <w:szCs w:val="18"/>
+              </w:rPr>
+              <w:t xml:space="preserve">远端账号情况</w:t>
+            </w:r>
+          </w:p>
+        </w:tc>
+        <w:tc>
+          <w:tcPr>
+            <w:tcW w:type="dxa" w:w="3550"/>
+            <w:tcBorders>
+              <w:top w:val="single" w:color="D5DBE3" w:sz="4"/>
+              <w:left w:val="single" w:color="D5DBE3" w:sz="4"/>
+              <w:bottom w:val="single" w:color="D5DBE3" w:sz="4"/>
+              <w:right w:val="single" w:color="D5DBE3" w:sz="4"/>
+            </w:tcBorders>
+            <w:shd w:fill="E8EEF5" w:val="clear"/>
+            <w:tcMar>
+              <w:top w:type="dxa" w:w="90"/>
+              <w:left w:type="dxa" w:w="100"/>
+              <w:bottom w:type="dxa" w:w="90"/>
+              <w:right w:type="dxa" w:w="100"/>
+            </w:tcMar>
+          </w:tcPr>
+          <w:p>
+            <w:pPr>
+              <w:spacing w:after="40" w:before="0" w:line="260"/>
+            </w:pPr>
+            <w:r>
+              <w:rPr>
+                <w:rFonts w:ascii="Arial" w:cs="Arial" w:eastAsia="Microsoft YaHei" w:hAnsi="Arial"/>
+                <w:b/>
+                <w:bCs/>
+                <w:sz w:val="18"/>
+                <w:szCs w:val="18"/>
+              </w:rPr>
+              <w:t xml:space="preserve">公钥授权位置</w:t>
+            </w:r>
+          </w:p>
+        </w:tc>
+        <w:tc>
+          <w:tcPr>
+            <w:tcW w:type="dxa" w:w="3846"/>
+            <w:tcBorders>
+              <w:top w:val="single" w:color="D5DBE3" w:sz="4"/>
+              <w:left w:val="single" w:color="D5DBE3" w:sz="4"/>
+              <w:bottom w:val="single" w:color="D5DBE3" w:sz="4"/>
+              <w:right w:val="single" w:color="D5DBE3" w:sz="4"/>
+            </w:tcBorders>
+            <w:shd w:fill="E8EEF5" w:val="clear"/>
+            <w:tcMar>
+              <w:top w:type="dxa" w:w="90"/>
+              <w:left w:type="dxa" w:w="100"/>
+              <w:bottom w:type="dxa" w:w="90"/>
+              <w:right w:type="dxa" w:w="100"/>
+            </w:tcMar>
+          </w:tcPr>
+          <w:p>
+            <w:pPr>
+              <w:spacing w:after="40" w:before="0" w:line="260"/>
+            </w:pPr>
+            <w:r>
+              <w:rPr>
+                <w:rFonts w:ascii="Arial" w:cs="Arial" w:eastAsia="Microsoft YaHei" w:hAnsi="Arial"/>
+                <w:b/>
+                <w:bCs/>
+                <w:sz w:val="18"/>
+                <w:szCs w:val="18"/>
+              </w:rPr>
+              <w:t xml:space="preserve">管理员注意事项</w:t>
+            </w:r>
+          </w:p>
+        </w:tc>
+      </w:tr>
+      <w:tr>
+        <w:trPr>
+          <w:cantSplit/>
+          <w:tblHeader w:val="false"/>
+        </w:trPr>
+        <w:tc>
+          <w:tcPr>
+            <w:tcW w:type="dxa" w:w="2350"/>
+            <w:tcBorders>
+              <w:top w:val="single" w:color="D5DBE3" w:sz="4"/>
+              <w:left w:val="single" w:color="D5DBE3" w:sz="4"/>
+              <w:bottom w:val="single" w:color="D5DBE3" w:sz="4"/>
+              <w:right w:val="single" w:color="D5DBE3" w:sz="4"/>
+            </w:tcBorders>
+            <w:shd w:fill="FFFFFF" w:val="clear"/>
+            <w:tcMar>
+              <w:top w:type="dxa" w:w="90"/>
+              <w:left w:type="dxa" w:w="100"/>
+              <w:bottom w:type="dxa" w:w="90"/>
+              <w:right w:type="dxa" w:w="100"/>
+            </w:tcMar>
+          </w:tcPr>
+          <w:p>
+            <w:pPr>
+              <w:spacing w:after="40" w:before="0" w:line="260"/>
+            </w:pPr>
+            <w:r>
+              <w:rPr>
+                <w:rFonts w:ascii="Arial" w:cs="Arial" w:eastAsia="Microsoft YaHei" w:hAnsi="Arial"/>
+                <w:b w:val="false"/>
+                <w:bCs w:val="false"/>
+                <w:sz w:val="18"/>
+                <w:szCs w:val="18"/>
+              </w:rPr>
+              <w:t xml:space="preserve">普通 Windows 用户</w:t>
+            </w:r>
+          </w:p>
+        </w:tc>
+        <w:tc>
+          <w:tcPr>
+            <w:tcW w:type="dxa" w:w="3550"/>
+            <w:tcBorders>
+              <w:top w:val="single" w:color="D5DBE3" w:sz="4"/>
+              <w:left w:val="single" w:color="D5DBE3" w:sz="4"/>
+              <w:bottom w:val="single" w:color="D5DBE3" w:sz="4"/>
+              <w:right w:val="single" w:color="D5DBE3" w:sz="4"/>
+            </w:tcBorders>
+            <w:shd w:fill="FFFFFF" w:val="clear"/>
+            <w:tcMar>
+              <w:top w:type="dxa" w:w="90"/>
+              <w:left w:type="dxa" w:w="100"/>
+              <w:bottom w:type="dxa" w:w="90"/>
+              <w:right w:type="dxa" w:w="100"/>
+            </w:tcMar>
+          </w:tcPr>
+          <w:p>
+            <w:pPr>
+              <w:spacing w:after="40" w:before="0" w:line="260"/>
+            </w:pPr>
+            <w:r>
+              <w:rPr>
+                <w:rFonts w:ascii="Arial" w:cs="Arial" w:eastAsia="Microsoft YaHei" w:hAnsi="Arial"/>
+                <w:b w:val="false"/>
+                <w:bCs w:val="false"/>
+                <w:sz w:val="18"/>
+                <w:szCs w:val="18"/>
+              </w:rPr>
+              <w:t xml:space="preserve">该用户配置文件目录下的 .ssh\authorized_keys</w:t>
+            </w:r>
+          </w:p>
+        </w:tc>
+        <w:tc>
+          <w:tcPr>
+            <w:tcW w:type="dxa" w:w="3846"/>
+            <w:tcBorders>
+              <w:top w:val="single" w:color="D5DBE3" w:sz="4"/>
+              <w:left w:val="single" w:color="D5DBE3" w:sz="4"/>
+              <w:bottom w:val="single" w:color="D5DBE3" w:sz="4"/>
+              <w:right w:val="single" w:color="D5DBE3" w:sz="4"/>
+            </w:tcBorders>
+            <w:shd w:fill="FFFFFF" w:val="clear"/>
+            <w:tcMar>
+              <w:top w:type="dxa" w:w="90"/>
+              <w:left w:type="dxa" w:w="100"/>
+              <w:bottom w:type="dxa" w:w="90"/>
+              <w:right w:type="dxa" w:w="100"/>
+            </w:tcMar>
+          </w:tcPr>
+          <w:p>
+            <w:pPr>
+              <w:spacing w:after="40" w:before="0" w:line="260"/>
+            </w:pPr>
+            <w:r>
+              <w:rPr>
+                <w:rFonts w:ascii="Arial" w:cs="Arial" w:eastAsia="Microsoft YaHei" w:hAnsi="Arial"/>
+                <w:b w:val="false"/>
+                <w:bCs w:val="false"/>
+                <w:sz w:val="18"/>
+                <w:szCs w:val="18"/>
+              </w:rPr>
+              <w:t xml:space="preserve">追加公钥为独立一行；保留已有公钥；核对该用户及必要系统主体的 ACL</w:t>
+            </w:r>
+          </w:p>
+        </w:tc>
+      </w:tr>
+      <w:tr>
+        <w:trPr>
+          <w:cantSplit/>
+          <w:tblHeader w:val="false"/>
+        </w:trPr>
+        <w:tc>
+          <w:tcPr>
+            <w:tcW w:type="dxa" w:w="2350"/>
+            <w:tcBorders>
+              <w:top w:val="single" w:color="D5DBE3" w:sz="4"/>
+              <w:left w:val="single" w:color="D5DBE3" w:sz="4"/>
+              <w:bottom w:val="single" w:color="D5DBE3" w:sz="4"/>
+              <w:right w:val="single" w:color="D5DBE3" w:sz="4"/>
+            </w:tcBorders>
+            <w:shd w:fill="FFFFFF" w:val="clear"/>
+            <w:tcMar>
+              <w:top w:type="dxa" w:w="90"/>
+              <w:left w:type="dxa" w:w="100"/>
+              <w:bottom w:type="dxa" w:w="90"/>
+              <w:right w:type="dxa" w:w="100"/>
+            </w:tcMar>
+          </w:tcPr>
+          <w:p>
+            <w:pPr>
+              <w:spacing w:after="40" w:before="0" w:line="260"/>
+            </w:pPr>
+            <w:r>
+              <w:rPr>
+                <w:rFonts w:ascii="Arial" w:cs="Arial" w:eastAsia="Microsoft YaHei" w:hAnsi="Arial"/>
+                <w:b w:val="false"/>
+                <w:bCs w:val="false"/>
+                <w:sz w:val="18"/>
+                <w:szCs w:val="18"/>
+              </w:rPr>
+              <w:t xml:space="preserve">命中管理员组专用规则的账号</w:t>
+            </w:r>
+          </w:p>
+        </w:tc>
+        <w:tc>
+          <w:tcPr>
+            <w:tcW w:type="dxa" w:w="3550"/>
+            <w:tcBorders>
+              <w:top w:val="single" w:color="D5DBE3" w:sz="4"/>
+              <w:left w:val="single" w:color="D5DBE3" w:sz="4"/>
+              <w:bottom w:val="single" w:color="D5DBE3" w:sz="4"/>
+              <w:right w:val="single" w:color="D5DBE3" w:sz="4"/>
+            </w:tcBorders>
+            <w:shd w:fill="FFFFFF" w:val="clear"/>
+            <w:tcMar>
+              <w:top w:type="dxa" w:w="90"/>
+              <w:left w:type="dxa" w:w="100"/>
+              <w:bottom w:type="dxa" w:w="90"/>
+              <w:right w:type="dxa" w:w="100"/>
+            </w:tcMar>
+          </w:tcPr>
+          <w:p>
+            <w:pPr>
+              <w:spacing w:after="40" w:before="0" w:line="260"/>
+            </w:pPr>
+            <w:r>
+              <w:rPr>
+                <w:rFonts w:ascii="Arial" w:cs="Arial" w:eastAsia="Microsoft YaHei" w:hAnsi="Arial"/>
+                <w:b w:val="false"/>
+                <w:bCs w:val="false"/>
+                <w:sz w:val="18"/>
+                <w:szCs w:val="18"/>
+              </w:rPr>
+              <w:t xml:space="preserve">C:\ProgramData\ssh\administrators_authorized_keys</w:t>
+            </w:r>
+          </w:p>
+        </w:tc>
+        <w:tc>
+          <w:tcPr>
+            <w:tcW w:type="dxa" w:w="3846"/>
+            <w:tcBorders>
+              <w:top w:val="single" w:color="D5DBE3" w:sz="4"/>
+              <w:left w:val="single" w:color="D5DBE3" w:sz="4"/>
+              <w:bottom w:val="single" w:color="D5DBE3" w:sz="4"/>
+              <w:right w:val="single" w:color="D5DBE3" w:sz="4"/>
+            </w:tcBorders>
+            <w:shd w:fill="FFFFFF" w:val="clear"/>
+            <w:tcMar>
+              <w:top w:type="dxa" w:w="90"/>
+              <w:left w:type="dxa" w:w="100"/>
+              <w:bottom w:type="dxa" w:w="90"/>
+              <w:right w:type="dxa" w:w="100"/>
+            </w:tcMar>
+          </w:tcPr>
+          <w:p>
+            <w:pPr>
+              <w:spacing w:after="40" w:before="0" w:line="260"/>
+            </w:pPr>
+            <w:r>
+              <w:rPr>
+                <w:rFonts w:ascii="Arial" w:cs="Arial" w:eastAsia="Microsoft YaHei" w:hAnsi="Arial"/>
+                <w:b w:val="false"/>
+                <w:bCs w:val="false"/>
+                <w:sz w:val="18"/>
+                <w:szCs w:val="18"/>
+              </w:rPr>
+              <w:t xml:space="preserve">常见默认 Match Group administrators 使用此文件；仅 SYSTEM 和 Administrators 应拥有相应访问权限</w:t>
+            </w:r>
+          </w:p>
+        </w:tc>
+      </w:tr>
+      <w:tr>
+        <w:trPr>
+          <w:cantSplit/>
+          <w:tblHeader w:val="false"/>
+        </w:trPr>
+        <w:tc>
+          <w:tcPr>
+            <w:tcW w:type="dxa" w:w="2350"/>
+            <w:tcBorders>
+              <w:top w:val="single" w:color="D5DBE3" w:sz="4"/>
+              <w:left w:val="single" w:color="D5DBE3" w:sz="4"/>
+              <w:bottom w:val="single" w:color="D5DBE3" w:sz="4"/>
+              <w:right w:val="single" w:color="D5DBE3" w:sz="4"/>
+            </w:tcBorders>
+            <w:shd w:fill="FFFFFF" w:val="clear"/>
+            <w:tcMar>
+              <w:top w:type="dxa" w:w="90"/>
+              <w:left w:type="dxa" w:w="100"/>
+              <w:bottom w:type="dxa" w:w="90"/>
+              <w:right w:type="dxa" w:w="100"/>
+            </w:tcMar>
+          </w:tcPr>
+          <w:p>
+            <w:pPr>
+              <w:spacing w:after="40" w:before="0" w:line="260"/>
+            </w:pPr>
+            <w:r>
+              <w:rPr>
+                <w:rFonts w:ascii="Arial" w:cs="Arial" w:eastAsia="Microsoft YaHei" w:hAnsi="Arial"/>
+                <w:b w:val="false"/>
+                <w:bCs w:val="false"/>
+                <w:sz w:val="18"/>
+                <w:szCs w:val="18"/>
+              </w:rPr>
+              <w:t xml:space="preserve">企业定制部署</w:t>
+            </w:r>
+          </w:p>
+        </w:tc>
+        <w:tc>
+          <w:tcPr>
+            <w:tcW w:type="dxa" w:w="3550"/>
+            <w:tcBorders>
+              <w:top w:val="single" w:color="D5DBE3" w:sz="4"/>
+              <w:left w:val="single" w:color="D5DBE3" w:sz="4"/>
+              <w:bottom w:val="single" w:color="D5DBE3" w:sz="4"/>
+              <w:right w:val="single" w:color="D5DBE3" w:sz="4"/>
+            </w:tcBorders>
+            <w:shd w:fill="FFFFFF" w:val="clear"/>
+            <w:tcMar>
+              <w:top w:type="dxa" w:w="90"/>
+              <w:left w:type="dxa" w:w="100"/>
+              <w:bottom w:type="dxa" w:w="90"/>
+              <w:right w:type="dxa" w:w="100"/>
+            </w:tcMar>
+          </w:tcPr>
+          <w:p>
+            <w:pPr>
+              <w:spacing w:after="40" w:before="0" w:line="260"/>
+            </w:pPr>
+            <w:r>
+              <w:rPr>
+                <w:rFonts w:ascii="Arial" w:cs="Arial" w:eastAsia="Microsoft YaHei" w:hAnsi="Arial"/>
+                <w:b w:val="false"/>
+                <w:bCs w:val="false"/>
+                <w:sz w:val="18"/>
+                <w:szCs w:val="18"/>
+              </w:rPr>
+              <w:t xml:space="preserve">sshd_config 实际指定的位置</w:t>
+            </w:r>
+          </w:p>
+        </w:tc>
+        <w:tc>
+          <w:tcPr>
+            <w:tcW w:type="dxa" w:w="3846"/>
+            <w:tcBorders>
+              <w:top w:val="single" w:color="D5DBE3" w:sz="4"/>
+              <w:left w:val="single" w:color="D5DBE3" w:sz="4"/>
+              <w:bottom w:val="single" w:color="D5DBE3" w:sz="4"/>
+              <w:right w:val="single" w:color="D5DBE3" w:sz="4"/>
+            </w:tcBorders>
+            <w:shd w:fill="FFFFFF" w:val="clear"/>
+            <w:tcMar>
+              <w:top w:type="dxa" w:w="90"/>
+              <w:left w:type="dxa" w:w="100"/>
+              <w:bottom w:type="dxa" w:w="90"/>
+              <w:right w:type="dxa" w:w="100"/>
+            </w:tcMar>
+          </w:tcPr>
+          <w:p>
+            <w:pPr>
+              <w:spacing w:after="40" w:before="0" w:line="260"/>
+            </w:pPr>
+            <w:r>
+              <w:rPr>
+                <w:rFonts w:ascii="Arial" w:cs="Arial" w:eastAsia="Microsoft YaHei" w:hAnsi="Arial"/>
+                <w:b w:val="false"/>
+                <w:bCs w:val="false"/>
+                <w:sz w:val="18"/>
+                <w:szCs w:val="18"/>
+              </w:rPr>
+              <w:t xml:space="preserve">核对公钥认证、账号限制和 Match 规则，不能假设上面两种路径必然生效</w:t>
+            </w:r>
+          </w:p>
+        </w:tc>
+      </w:tr>
+    </w:tbl>
+    <w:p>
+      <w:pPr>
+        <w:spacing w:after="60"/>
+      </w:pPr>
+    </w:p>
+    <w:p>
+      <w:pPr>
+        <w:spacing w:after="120" w:line="300"/>
+      </w:pPr>
+      <w:r>
+        <w:rPr>
+          <w:rFonts w:ascii="Arial" w:cs="Arial" w:eastAsia="Microsoft YaHei" w:hAnsi="Arial"/>
+        </w:rPr>
+        <w:t xml:space="preserve">必须写入完整的 .pub 公钥单行，不能折行、贴入私钥或覆盖其他人的公钥。管理员同时检查 OpenSSH 日志及授权文件权限；若修改 sshd_config，先验证配置并安排批准的服务维护窗口。公钥授权完成不等于客户端已信任该服务器，还需下一步核对主机指纹。</w:t>
+      </w:r>
+    </w:p>
+    <w:p>
+      <w:pPr>
+        <w:spacing w:after="120" w:line="300"/>
+      </w:pPr>
+      <w:r>
+        <w:rPr>
+          <w:rFonts w:ascii="Arial" w:cs="Arial" w:eastAsia="Microsoft YaHei" w:hAnsi="Arial"/>
+        </w:rPr>
+        <w:t xml:space="preserve">步骤四：核对控制机主机指纹，建立专用 known_hosts。</w:t>
+      </w:r>
+    </w:p>
+    <w:p>
+      <w:pPr>
+        <w:spacing w:after="120" w:line="300"/>
+      </w:pPr>
+      <w:r>
+        <w:rPr>
+          <w:rFonts w:ascii="Arial" w:cs="Arial" w:eastAsia="Microsoft YaHei" w:hAnsi="Arial"/>
+        </w:rPr>
+        <w:t xml:space="preserve">管理员应从控制机本地控制台或可信资产记录提供 SSH 主机公钥的 SHA256 指纹。客户端采集到的公钥只有与该可信指纹一致后才能被信任；ssh-keyscan 的输出本身不证明服务器身份。</w:t>
+      </w:r>
+    </w:p>
+    <w:p>
+      <w:pPr>
+        <w:spacing w:after="120" w:line="300"/>
+      </w:pPr>
+      <w:r>
+        <w:rPr>
+          <w:rFonts w:ascii="Arial" w:cs="Arial" w:eastAsia="Microsoft YaHei" w:hAnsi="Arial"/>
+        </w:rPr>
+        <w:t xml:space="preserve">以下示例在接收人新电脑执行，仅获取主机公钥，不登录或操作硬件。把占位地址替换为获准主机名或 IP；后续 JSON 的 ssh.host 必须使用同一个值。</w:t>
+      </w:r>
+    </w:p>
+    <w:p>
+      <w:pPr>
+        <w:shd w:fill="F2F4F7" w:val="clear"/>
+        <w:spacing w:after="20" w:before="0" w:line="240"/>
+      </w:pPr>
+      <w:r>
+        <w:rPr>
+          <w:rFonts w:ascii="Consolas" w:cs="Consolas" w:eastAsia="Microsoft YaHei" w:hAnsi="Consolas"/>
+          <w:sz w:val="17"/>
+          <w:szCs w:val="17"/>
+        </w:rPr>
+        <w:t xml:space="preserve">$serverHost = 'REPLACE_WITH_APPROVED_HOST'</w:t>
+      </w:r>
+    </w:p>
+    <w:p>
+      <w:pPr>
+        <w:shd w:fill="F2F4F7" w:val="clear"/>
+        <w:spacing w:after="20" w:before="0" w:line="240"/>
+      </w:pPr>
+      <w:r>
+        <w:rPr>
+          <w:rFonts w:ascii="Consolas" w:cs="Consolas" w:eastAsia="Microsoft YaHei" w:hAnsi="Consolas"/>
+          <w:sz w:val="17"/>
+          <w:szCs w:val="17"/>
+        </w:rPr>
+        <w:t xml:space="preserve">$candidate = Join-Path $HOME '.ssh\hardware_host_candidate'</w:t>
+      </w:r>
+    </w:p>
+    <w:p>
+      <w:pPr>
+        <w:shd w:fill="F2F4F7" w:val="clear"/>
+        <w:spacing w:after="20" w:before="0" w:line="240"/>
+      </w:pPr>
+      <w:r>
+        <w:rPr>
+          <w:rFonts w:ascii="Consolas" w:cs="Consolas" w:eastAsia="Microsoft YaHei" w:hAnsi="Consolas"/>
+          <w:sz w:val="17"/>
+          <w:szCs w:val="17"/>
+        </w:rPr>
+        <w:t xml:space="preserve">$knownHosts = Join-Path $HOME '.ssh\known_hosts.hardware'</w:t>
+      </w:r>
+    </w:p>
+    <w:p>
+      <w:pPr>
+        <w:shd w:fill="F2F4F7" w:val="clear"/>
+        <w:spacing w:after="20" w:before="0" w:line="240"/>
+      </w:pPr>
+      <w:r>
+        <w:rPr>
+          <w:rFonts w:ascii="Consolas" w:cs="Consolas" w:eastAsia="Microsoft YaHei" w:hAnsi="Consolas"/>
+          <w:sz w:val="17"/>
+          <w:szCs w:val="17"/>
+        </w:rPr>
+        <w:t xml:space="preserve">if (Test-Path $candidate) {</w:t>
+      </w:r>
+    </w:p>
+    <w:p>
+      <w:pPr>
+        <w:shd w:fill="F2F4F7" w:val="clear"/>
+        <w:spacing w:after="20" w:before="0" w:line="240"/>
+      </w:pPr>
+      <w:r>
+        <w:rPr>
+          <w:rFonts w:ascii="Consolas" w:cs="Consolas" w:eastAsia="Microsoft YaHei" w:hAnsi="Consolas"/>
+          <w:sz w:val="17"/>
+          <w:szCs w:val="17"/>
+        </w:rPr>
+        <w:t xml:space="preserve">    throw 'Candidate file already exists; review it before another scan.'</w:t>
+      </w:r>
+    </w:p>
+    <w:p>
+      <w:pPr>
+        <w:shd w:fill="F2F4F7" w:val="clear"/>
+        <w:spacing w:after="20" w:before="0" w:line="240"/>
+      </w:pPr>
+      <w:r>
+        <w:rPr>
+          <w:rFonts w:ascii="Consolas" w:cs="Consolas" w:eastAsia="Microsoft YaHei" w:hAnsi="Consolas"/>
+          <w:sz w:val="17"/>
+          <w:szCs w:val="17"/>
+        </w:rPr>
+        <w:t xml:space="preserve">}</w:t>
+      </w:r>
+    </w:p>
+    <w:p>
+      <w:pPr>
+        <w:shd w:fill="F2F4F7" w:val="clear"/>
+        <w:spacing w:after="20" w:before="0" w:line="240"/>
+      </w:pPr>
+      <w:r>
+        <w:rPr>
+          <w:rFonts w:ascii="Consolas" w:cs="Consolas" w:eastAsia="Microsoft YaHei" w:hAnsi="Consolas"/>
+          <w:sz w:val="17"/>
+          <w:szCs w:val="17"/>
+        </w:rPr>
+        <w:t xml:space="preserve">ssh-keyscan -T 10 -t ed25519 $serverHost |</w:t>
+      </w:r>
+    </w:p>
+    <w:p>
+      <w:pPr>
+        <w:shd w:fill="F2F4F7" w:val="clear"/>
+        <w:spacing w:after="20" w:before="0" w:line="240"/>
+      </w:pPr>
+      <w:r>
+        <w:rPr>
+          <w:rFonts w:ascii="Consolas" w:cs="Consolas" w:eastAsia="Microsoft YaHei" w:hAnsi="Consolas"/>
+          <w:sz w:val="17"/>
+          <w:szCs w:val="17"/>
+        </w:rPr>
+        <w:t xml:space="preserve">    Set-Content -LiteralPath $candidate -Encoding ascii</w:t>
+      </w:r>
+    </w:p>
+    <w:p>
+      <w:pPr>
+        <w:shd w:fill="F2F4F7" w:val="clear"/>
+        <w:spacing w:after="20" w:before="0" w:line="240"/>
+      </w:pPr>
+      <w:r>
+        <w:rPr>
+          <w:rFonts w:ascii="Consolas" w:cs="Consolas" w:eastAsia="Microsoft YaHei" w:hAnsi="Consolas"/>
+          <w:sz w:val="17"/>
+          <w:szCs w:val="17"/>
+        </w:rPr>
+        <w:t xml:space="preserve">ssh-keygen -lf $candidate</w:t>
+      </w:r>
+    </w:p>
+    <w:p>
+      <w:pPr>
+        <w:spacing w:after="120" w:line="300"/>
+      </w:pPr>
+      <w:r>
+        <w:rPr>
+          <w:rFonts w:ascii="Arial" w:cs="Arial" w:eastAsia="Microsoft YaHei" w:hAnsi="Arial"/>
+        </w:rPr>
+        <w:t xml:space="preserve">上面选择的是服务端 Ed25519 主机密钥，与用户登录密钥是两个不同概念；若服务端使用其他获准主机密钥算法，按管理员提供的类型调整 -t。扫描无输出、解析失败或指纹不一致时停止，不写入信任文件。</w:t>
+      </w:r>
+    </w:p>
+    <w:p>
+      <w:pPr>
+        <w:spacing w:after="120" w:line="300"/>
+      </w:pPr>
+      <w:r>
+        <w:rPr>
+          <w:rFonts w:ascii="Arial" w:cs="Arial" w:eastAsia="Microsoft YaHei" w:hAnsi="Arial"/>
+        </w:rPr>
+        <w:t xml:space="preserve">只有通过独立渠道逐项核对候选公钥指纹后，才执行下面的追加操作。如果 known_hosts.hardware 已有同一主机的不同密钥，先让管理员确认原因，不删除旧记录来绕过告警。</w:t>
+      </w:r>
+    </w:p>
+    <w:p>
+      <w:pPr>
+        <w:shd w:fill="F2F4F7" w:val="clear"/>
+        <w:spacing w:after="20" w:before="0" w:line="240"/>
+      </w:pPr>
+      <w:r>
+        <w:rPr>
+          <w:rFonts w:ascii="Consolas" w:cs="Consolas" w:eastAsia="Microsoft YaHei" w:hAnsi="Consolas"/>
+          <w:sz w:val="17"/>
+          <w:szCs w:val="17"/>
+        </w:rPr>
+        <w:t xml:space="preserve">Get-Content -LiteralPath $candidate |</w:t>
+      </w:r>
+    </w:p>
+    <w:p>
+      <w:pPr>
+        <w:shd w:fill="F2F4F7" w:val="clear"/>
+        <w:spacing w:after="20" w:before="0" w:line="240"/>
+      </w:pPr>
+      <w:r>
+        <w:rPr>
+          <w:rFonts w:ascii="Consolas" w:cs="Consolas" w:eastAsia="Microsoft YaHei" w:hAnsi="Consolas"/>
+          <w:sz w:val="17"/>
+          <w:szCs w:val="17"/>
+        </w:rPr>
+        <w:t xml:space="preserve">    Add-Content -LiteralPath $knownHosts -Encoding ascii</w:t>
+      </w:r>
+    </w:p>
+    <w:p>
+      <w:pPr>
+        <w:shd w:fill="F2F4F7" w:val="clear"/>
+        <w:spacing w:after="20" w:before="0" w:line="240"/>
+      </w:pPr>
+      <w:r>
+        <w:rPr>
+          <w:rFonts w:ascii="Consolas" w:cs="Consolas" w:eastAsia="Microsoft YaHei" w:hAnsi="Consolas"/>
+          <w:sz w:val="17"/>
+          <w:szCs w:val="17"/>
+        </w:rPr>
+        <w:t xml:space="preserve">Remove-Item -LiteralPath $candidate</w:t>
+      </w:r>
+    </w:p>
+    <w:p>
+      <w:pPr>
+        <w:spacing w:after="120" w:line="300"/>
+      </w:pPr>
+      <w:r>
+        <w:rPr>
+          <w:rFonts w:ascii="Arial" w:cs="Arial" w:eastAsia="Microsoft YaHei" w:hAnsi="Arial"/>
+        </w:rPr>
+        <w:t xml:space="preserve">在新电脑的 $HOME\.ssh\config 中添加或合并该目标专用 Host 段，不覆盖原文件。下面是 OpenSSH 配置文本，不是 PowerShell 命令；替换主机和用户目录占位值。带引号路径中的双反斜杠用于 OpenSSH 配置转义，不能照搬 JSON 格式或写入私钥内容。</w:t>
+      </w:r>
+    </w:p>
+    <w:p>
+      <w:pPr>
+        <w:shd w:fill="F2F4F7" w:val="clear"/>
+        <w:spacing w:after="20" w:before="0" w:line="240"/>
+      </w:pPr>
+      <w:r>
+        <w:rPr>
+          <w:rFonts w:ascii="Consolas" w:cs="Consolas" w:eastAsia="Microsoft YaHei" w:hAnsi="Consolas"/>
+          <w:sz w:val="17"/>
+          <w:szCs w:val="17"/>
+        </w:rPr>
+        <w:t xml:space="preserve">Host REPLACE_WITH_APPROVED_HOST</w:t>
+      </w:r>
+    </w:p>
+    <w:p>
+      <w:pPr>
+        <w:shd w:fill="F2F4F7" w:val="clear"/>
+        <w:spacing w:after="20" w:before="0" w:line="240"/>
+      </w:pPr>
+      <w:r>
+        <w:rPr>
+          <w:rFonts w:ascii="Consolas" w:cs="Consolas" w:eastAsia="Microsoft YaHei" w:hAnsi="Consolas"/>
+          <w:sz w:val="17"/>
+          <w:szCs w:val="17"/>
+        </w:rPr>
+        <w:t xml:space="preserve">    BatchMode yes</w:t>
+      </w:r>
+    </w:p>
+    <w:p>
+      <w:pPr>
+        <w:shd w:fill="F2F4F7" w:val="clear"/>
+        <w:spacing w:after="20" w:before="0" w:line="240"/>
+      </w:pPr>
+      <w:r>
+        <w:rPr>
+          <w:rFonts w:ascii="Consolas" w:cs="Consolas" w:eastAsia="Microsoft YaHei" w:hAnsi="Consolas"/>
+          <w:sz w:val="17"/>
+          <w:szCs w:val="17"/>
+        </w:rPr>
+        <w:t xml:space="preserve">    IdentitiesOnly yes</w:t>
+      </w:r>
+    </w:p>
+    <w:p>
+      <w:pPr>
+        <w:shd w:fill="F2F4F7" w:val="clear"/>
+        <w:spacing w:after="20" w:before="0" w:line="240"/>
+      </w:pPr>
+      <w:r>
+        <w:rPr>
+          <w:rFonts w:ascii="Consolas" w:cs="Consolas" w:eastAsia="Microsoft YaHei" w:hAnsi="Consolas"/>
+          <w:sz w:val="17"/>
+          <w:szCs w:val="17"/>
+        </w:rPr>
+        <w:t xml:space="preserve">    PreferredAuthentications publickey</w:t>
+      </w:r>
+    </w:p>
+    <w:p>
+      <w:pPr>
+        <w:shd w:fill="F2F4F7" w:val="clear"/>
+        <w:spacing w:after="20" w:before="0" w:line="240"/>
+      </w:pPr>
+      <w:r>
+        <w:rPr>
+          <w:rFonts w:ascii="Consolas" w:cs="Consolas" w:eastAsia="Microsoft YaHei" w:hAnsi="Consolas"/>
+          <w:sz w:val="17"/>
+          <w:szCs w:val="17"/>
+        </w:rPr>
+        <w:t xml:space="preserve">    PasswordAuthentication no</w:t>
+      </w:r>
+    </w:p>
+    <w:p>
+      <w:pPr>
+        <w:shd w:fill="F2F4F7" w:val="clear"/>
+        <w:spacing w:after="20" w:before="0" w:line="240"/>
+      </w:pPr>
+      <w:r>
+        <w:rPr>
+          <w:rFonts w:ascii="Consolas" w:cs="Consolas" w:eastAsia="Microsoft YaHei" w:hAnsi="Consolas"/>
+          <w:sz w:val="17"/>
+          <w:szCs w:val="17"/>
+        </w:rPr>
+        <w:t xml:space="preserve">    KbdInteractiveAuthentication no</w:t>
+      </w:r>
+    </w:p>
+    <w:p>
+      <w:pPr>
+        <w:shd w:fill="F2F4F7" w:val="clear"/>
+        <w:spacing w:after="20" w:before="0" w:line="240"/>
+      </w:pPr>
+      <w:r>
+        <w:rPr>
+          <w:rFonts w:ascii="Consolas" w:cs="Consolas" w:eastAsia="Microsoft YaHei" w:hAnsi="Consolas"/>
+          <w:sz w:val="17"/>
+          <w:szCs w:val="17"/>
+        </w:rPr>
+        <w:t xml:space="preserve">    StrictHostKeyChecking yes</w:t>
+      </w:r>
+    </w:p>
+    <w:p>
+      <w:pPr>
+        <w:shd w:fill="F2F4F7" w:val="clear"/>
+        <w:spacing w:after="20" w:before="0" w:line="240"/>
+      </w:pPr>
+      <w:r>
+        <w:rPr>
+          <w:rFonts w:ascii="Consolas" w:cs="Consolas" w:eastAsia="Microsoft YaHei" w:hAnsi="Consolas"/>
+          <w:sz w:val="17"/>
+          <w:szCs w:val="17"/>
+        </w:rPr>
+        <w:t xml:space="preserve">    UserKnownHostsFile "C:\\Users\\YOUR_USER\\.ssh\\known_hosts.hardware"</w:t>
+      </w:r>
+    </w:p>
+    <w:p>
+      <w:pPr>
+        <w:shd w:fill="F2F4F7" w:val="clear"/>
+        <w:spacing w:after="20" w:before="0" w:line="240"/>
+      </w:pPr>
+      <w:r>
+        <w:rPr>
+          <w:rFonts w:ascii="Consolas" w:cs="Consolas" w:eastAsia="Microsoft YaHei" w:hAnsi="Consolas"/>
+          <w:sz w:val="17"/>
+          <w:szCs w:val="17"/>
+        </w:rPr>
+        <w:t xml:space="preserve">    GlobalKnownHostsFile NUL</w:t>
+      </w:r>
+    </w:p>
+    <w:p>
+      <w:pPr>
+        <w:spacing w:after="120" w:line="300"/>
+      </w:pPr>
+      <w:r>
+        <w:rPr>
+          <w:rFonts w:ascii="Arial" w:cs="Arial" w:eastAsia="Microsoft YaHei" w:hAnsi="Arial"/>
+        </w:rPr>
+        <w:t xml:space="preserve">让该目标专用配置优先于可能冲突的宽泛 Host * 配置，并核对最终生效值。禁止使用 StrictHostKeyChecking=no 或 accept-new 代替指纹核对。首次缺少可信主机记录时应停止，不能让批处理自动接受未知主机。</w:t>
+      </w:r>
+    </w:p>
+    <w:p>
+      <w:pPr>
+        <w:spacing w:after="120" w:line="300"/>
+      </w:pPr>
+      <w:r>
+        <w:rPr>
+          <w:rFonts w:ascii="Arial" w:cs="Arial" w:eastAsia="Microsoft YaHei" w:hAnsi="Arial"/>
+        </w:rPr>
+        <w:t xml:space="preserve">步骤五：把新电脑身份接入本系统的本地硬件配置。</w:t>
+      </w:r>
+    </w:p>
+    <w:p>
+      <w:pPr>
+        <w:spacing w:after="120" w:line="300"/>
+      </w:pPr>
+      <w:r>
+        <w:rPr>
+          <w:rFonts w:ascii="Arial" w:cs="Arial" w:eastAsia="Microsoft YaHei" w:hAnsi="Arial"/>
+        </w:rPr>
+        <w:t xml:space="preserve">只修改 config\local\hardware-flow.json 内的 ssh 对象，保留 remote、flow、hostOs 等其他配置。下面的路径应改为接收人本机实际私钥文件路径；它不是私钥内容。</w:t>
+      </w:r>
+    </w:p>
+    <w:p>
+      <w:pPr>
+        <w:shd w:fill="F2F4F7" w:val="clear"/>
+        <w:spacing w:after="20" w:before="0" w:line="240"/>
+      </w:pPr>
+      <w:r>
+        <w:rPr>
+          <w:rFonts w:ascii="Consolas" w:cs="Consolas" w:eastAsia="Microsoft YaHei" w:hAnsi="Consolas"/>
+          <w:sz w:val="17"/>
+          <w:szCs w:val="17"/>
+        </w:rPr>
+        <w:t xml:space="preserve">{</w:t>
+      </w:r>
+    </w:p>
+    <w:p>
+      <w:pPr>
+        <w:shd w:fill="F2F4F7" w:val="clear"/>
+        <w:spacing w:after="20" w:before="0" w:line="240"/>
+      </w:pPr>
+      <w:r>
+        <w:rPr>
+          <w:rFonts w:ascii="Consolas" w:cs="Consolas" w:eastAsia="Microsoft YaHei" w:hAnsi="Consolas"/>
+          <w:sz w:val="17"/>
+          <w:szCs w:val="17"/>
+        </w:rPr>
+        <w:t xml:space="preserve">  "ssh": {</w:t>
+      </w:r>
+    </w:p>
+    <w:p>
+      <w:pPr>
+        <w:shd w:fill="F2F4F7" w:val="clear"/>
+        <w:spacing w:after="20" w:before="0" w:line="240"/>
+      </w:pPr>
+      <w:r>
+        <w:rPr>
+          <w:rFonts w:ascii="Consolas" w:cs="Consolas" w:eastAsia="Microsoft YaHei" w:hAnsi="Consolas"/>
+          <w:sz w:val="17"/>
+          <w:szCs w:val="17"/>
+        </w:rPr>
+        <w:t xml:space="preserve">    "user": "REPLACE_WITH_APPROVED_USER",</w:t>
+      </w:r>
+    </w:p>
+    <w:p>
+      <w:pPr>
+        <w:shd w:fill="F2F4F7" w:val="clear"/>
+        <w:spacing w:after="20" w:before="0" w:line="240"/>
+      </w:pPr>
+      <w:r>
+        <w:rPr>
+          <w:rFonts w:ascii="Consolas" w:cs="Consolas" w:eastAsia="Microsoft YaHei" w:hAnsi="Consolas"/>
+          <w:sz w:val="17"/>
+          <w:szCs w:val="17"/>
+        </w:rPr>
+        <w:t xml:space="preserve">    "host": "REPLACE_WITH_APPROVED_HOST",</w:t>
+      </w:r>
+    </w:p>
+    <w:p>
+      <w:pPr>
+        <w:shd w:fill="F2F4F7" w:val="clear"/>
+        <w:spacing w:after="20" w:before="0" w:line="240"/>
+      </w:pPr>
+      <w:r>
+        <w:rPr>
+          <w:rFonts w:ascii="Consolas" w:cs="Consolas" w:eastAsia="Microsoft YaHei" w:hAnsi="Consolas"/>
+          <w:sz w:val="17"/>
+          <w:szCs w:val="17"/>
+        </w:rPr>
+        <w:t xml:space="preserve">    "connectTimeoutSeconds": 10,</w:t>
+      </w:r>
+    </w:p>
+    <w:p>
+      <w:pPr>
+        <w:shd w:fill="F2F4F7" w:val="clear"/>
+        <w:spacing w:after="20" w:before="0" w:line="240"/>
+      </w:pPr>
+      <w:r>
+        <w:rPr>
+          <w:rFonts w:ascii="Consolas" w:cs="Consolas" w:eastAsia="Microsoft YaHei" w:hAnsi="Consolas"/>
+          <w:sz w:val="17"/>
+          <w:szCs w:val="17"/>
+        </w:rPr>
+        <w:t xml:space="preserve">    "identityFile": "C:\\Users\\YOUR_USER\\.ssh\\hardware_flow_ed25519",</w:t>
+      </w:r>
+    </w:p>
+    <w:p>
+      <w:pPr>
+        <w:shd w:fill="F2F4F7" w:val="clear"/>
+        <w:spacing w:after="20" w:before="0" w:line="240"/>
+      </w:pPr>
+      <w:r>
+        <w:rPr>
+          <w:rFonts w:ascii="Consolas" w:cs="Consolas" w:eastAsia="Microsoft YaHei" w:hAnsi="Consolas"/>
+          <w:sz w:val="17"/>
+          <w:szCs w:val="17"/>
+        </w:rPr>
+        <w:t xml:space="preserve">    "hostKeyAlias": ""</w:t>
+      </w:r>
+    </w:p>
+    <w:p>
+      <w:pPr>
+        <w:shd w:fill="F2F4F7" w:val="clear"/>
+        <w:spacing w:after="20" w:before="0" w:line="240"/>
+      </w:pPr>
+      <w:r>
+        <w:rPr>
+          <w:rFonts w:ascii="Consolas" w:cs="Consolas" w:eastAsia="Microsoft YaHei" w:hAnsi="Consolas"/>
+          <w:sz w:val="17"/>
+          <w:szCs w:val="17"/>
+        </w:rPr>
+        <w:t xml:space="preserve">  }</w:t>
+      </w:r>
+    </w:p>
+    <w:p>
+      <w:pPr>
+        <w:shd w:fill="F2F4F7" w:val="clear"/>
+        <w:spacing w:after="20" w:before="0" w:line="240"/>
+      </w:pPr>
+      <w:r>
+        <w:rPr>
+          <w:rFonts w:ascii="Consolas" w:cs="Consolas" w:eastAsia="Microsoft YaHei" w:hAnsi="Consolas"/>
+          <w:sz w:val="17"/>
+          <w:szCs w:val="17"/>
+        </w:rPr>
+        <w:t xml:space="preserve">}</w:t>
+      </w:r>
+    </w:p>
+    <w:p>
+      <w:pPr>
+        <w:spacing w:after="120" w:line="300"/>
+      </w:pPr>
+      <w:r>
+        <w:rPr>
+          <w:rFonts w:ascii="Arial" w:cs="Arial" w:eastAsia="Microsoft YaHei" w:hAnsi="Arial"/>
+        </w:rPr>
+        <w:t xml:space="preserve">这里将 hostKeyAlias 留空，是因为专用 known_hosts 已按同一 ssh.host 登记。如果确需别名，只能使用已经核对并登记过的那个别名；不能把旧电脑的别名直接当作信任证明。机器清单中的账号和地址也应与该配置一致。</w:t>
+      </w:r>
+    </w:p>
+    <w:p>
+      <w:pPr>
+        <w:spacing w:after="120" w:line="300"/>
+      </w:pPr>
+      <w:r>
+        <w:rPr>
+          <w:rFonts w:ascii="Arial" w:cs="Arial" w:eastAsia="Microsoft YaHei" w:hAnsi="Arial"/>
+        </w:rPr>
+        <w:t xml:space="preserve">当前脚本读取 JSON 中的 identityFile / hostKeyAlias，但不读取任意新增的 knownHostsFile 字段。因此，专用 known_hosts 路径和严格校验策略放在上述本机 OpenSSH config 中；JSON 提供目标和登录身份，两者共同生效，均不提交 Git。</w:t>
+      </w:r>
+    </w:p>
+    <w:p>
+      <w:pPr>
+        <w:spacing w:after="120" w:line="300"/>
+      </w:pPr>
+      <w:r>
+        <w:rPr>
+          <w:rFonts w:ascii="Arial" w:cs="Arial" w:eastAsia="Microsoft YaHei" w:hAnsi="Arial"/>
+        </w:rPr>
+        <w:t xml:space="preserve">步骤六：先检查生效配置和连接，再开放硬件操作。</w:t>
+      </w:r>
+    </w:p>
+    <w:p>
+      <w:pPr>
+        <w:spacing w:after="120" w:line="300"/>
+      </w:pPr>
+      <w:r>
+        <w:rPr>
+          <w:rFonts w:ascii="Arial" w:cs="Arial" w:eastAsia="Microsoft YaHei" w:hAnsi="Arial"/>
+        </w:rPr>
+        <w:t xml:space="preserve">ssh -G 只展开配置、不发起远程登录；Test-NetConnection 会向获准目标进行网络端口探测。先在同一接收人账号下运行：</w:t>
+      </w:r>
+    </w:p>
+    <w:p>
+      <w:pPr>
+        <w:shd w:fill="F2F4F7" w:val="clear"/>
+        <w:spacing w:after="20" w:before="0" w:line="240"/>
+      </w:pPr>
+      <w:r>
+        <w:rPr>
+          <w:rFonts w:ascii="Consolas" w:cs="Consolas" w:eastAsia="Microsoft YaHei" w:hAnsi="Consolas"/>
+          <w:sz w:val="17"/>
+          <w:szCs w:val="17"/>
+        </w:rPr>
+        <w:t xml:space="preserve">ssh -G REPLACE_WITH_APPROVED_HOST |</w:t>
+      </w:r>
+    </w:p>
+    <w:p>
+      <w:pPr>
+        <w:shd w:fill="F2F4F7" w:val="clear"/>
+        <w:spacing w:after="20" w:before="0" w:line="240"/>
+      </w:pPr>
+      <w:r>
+        <w:rPr>
+          <w:rFonts w:ascii="Consolas" w:cs="Consolas" w:eastAsia="Microsoft YaHei" w:hAnsi="Consolas"/>
+          <w:sz w:val="17"/>
+          <w:szCs w:val="17"/>
+        </w:rPr>
+        <w:t xml:space="preserve">    Select-String '^(hostname|userknownhostsfile|stricthostkeychecking|batchmode|identitiesonly) '</w:t>
+      </w:r>
+    </w:p>
+    <w:p>
+      <w:pPr>
+        <w:shd w:fill="F2F4F7" w:val="clear"/>
+        <w:spacing w:after="20" w:before="0" w:line="240"/>
+      </w:pPr>
+      <w:r>
+        <w:rPr>
+          <w:rFonts w:ascii="Consolas" w:cs="Consolas" w:eastAsia="Microsoft YaHei" w:hAnsi="Consolas"/>
+          <w:sz w:val="17"/>
+          <w:szCs w:val="17"/>
+        </w:rPr>
+        <w:t xml:space="preserve">Test-NetConnection -ComputerName REPLACE_WITH_APPROVED_HOST -Port 22</w:t>
+      </w:r>
+    </w:p>
+    <w:p>
+      <w:pPr>
+        <w:spacing w:after="120" w:line="300"/>
+      </w:pPr>
+      <w:r>
+        <w:rPr>
+          <w:rFonts w:ascii="Arial" w:cs="Arial" w:eastAsia="Microsoft YaHei" w:hAnsi="Arial"/>
+        </w:rPr>
+        <w:t xml:space="preserve">TCP 可达只证明端口连通，不证明身份认证成功。最后，在仓库根目录运行系统自带的无硬件动作预检：</w:t>
+      </w:r>
+    </w:p>
+    <w:p>
+      <w:pPr>
+        <w:shd w:fill="F2F4F7" w:val="clear"/>
+        <w:spacing w:after="20" w:before="0" w:line="240"/>
+      </w:pPr>
+      <w:r>
+        <w:rPr>
+          <w:rFonts w:ascii="Consolas" w:cs="Consolas" w:eastAsia="Microsoft YaHei" w:hAnsi="Consolas"/>
+          <w:sz w:val="17"/>
+          <w:szCs w:val="17"/>
+        </w:rPr>
+        <w:t xml:space="preserve">powershell -NoProfile -ExecutionPolicy Bypass -File .\scripts\Test-SshAccess.ps1 -ConfigPath .\config\local\hardware-flow.json</w:t>
+      </w:r>
+    </w:p>
+    <w:p>
+      <w:pPr>
+        <w:shd w:fill="F2F4F7" w:val="clear"/>
+        <w:spacing w:after="20" w:before="0" w:line="240"/>
+      </w:pPr>
+      <w:r>
+        <w:rPr>
+          <w:rFonts w:ascii="Consolas" w:cs="Consolas" w:eastAsia="Microsoft YaHei" w:hAnsi="Consolas"/>
+          <w:sz w:val="17"/>
+          <w:szCs w:val="17"/>
+        </w:rPr>
+        <w:t xml:space="preserve">$LASTEXITCODE</w:t>
+      </w:r>
+    </w:p>
+    <w:p>
+      <w:pPr>
+        <w:spacing w:after="120" w:line="300"/>
+      </w:pPr>
+      <w:r>
+        <w:rPr>
+          <w:rFonts w:ascii="Arial" w:cs="Arial" w:eastAsia="Microsoft YaHei" w:hAnsi="Arial"/>
+        </w:rPr>
+        <w:t xml:space="preserve">通过标准为同时出现 SSH_OK 且退出码为 0。这个脚本只在远端执行 echo SSH_OK，不烧录、不关电、不抓串口，也不运行 MLC。通过后才能在另行批准的窗口进入硬件流程；不能以 SSH 成功代替镜像、USB、电源、串口和测试工具的检查。</w:t>
+      </w:r>
+    </w:p>
+    <w:tbl>
+      <w:tblPr>
+        <w:tblW w:type="dxa" w:w="9746"/>
+        <w:tblBorders>
+          <w:top w:val="single" w:color="auto" w:sz="4"/>
+          <w:left w:val="single" w:color="auto" w:sz="4"/>
+          <w:bottom w:val="single" w:color="auto" w:sz="4"/>
+          <w:right w:val="single" w:color="auto" w:sz="4"/>
+          <w:insideH w:val="single" w:color="auto" w:sz="4"/>
+          <w:insideV w:val="single" w:color="auto" w:sz="4"/>
+        </w:tblBorders>
+      </w:tblPr>
+      <w:tblGrid>
+        <w:gridCol w:w="2900"/>
+        <w:gridCol w:w="6846"/>
+      </w:tblGrid>
+      <w:tr>
+        <w:trPr>
+          <w:cantSplit/>
+          <w:tblHeader/>
+        </w:trPr>
+        <w:tc>
+          <w:tcPr>
+            <w:tcW w:type="dxa" w:w="2900"/>
+            <w:tcBorders>
+              <w:top w:val="single" w:color="D5DBE3" w:sz="4"/>
+              <w:left w:val="single" w:color="D5DBE3" w:sz="4"/>
+              <w:bottom w:val="single" w:color="D5DBE3" w:sz="4"/>
+              <w:right w:val="single" w:color="D5DBE3" w:sz="4"/>
+            </w:tcBorders>
+            <w:shd w:fill="E8EEF5" w:val="clear"/>
+            <w:tcMar>
+              <w:top w:type="dxa" w:w="90"/>
+              <w:left w:type="dxa" w:w="100"/>
+              <w:bottom w:type="dxa" w:w="90"/>
+              <w:right w:type="dxa" w:w="100"/>
+            </w:tcMar>
+          </w:tcPr>
+          <w:p>
+            <w:pPr>
+              <w:spacing w:after="40" w:before="0" w:line="260"/>
+            </w:pPr>
+            <w:r>
+              <w:rPr>
+                <w:rFonts w:ascii="Arial" w:cs="Arial" w:eastAsia="Microsoft YaHei" w:hAnsi="Arial"/>
+                <w:b/>
+                <w:bCs/>
+                <w:sz w:val="18"/>
+                <w:szCs w:val="18"/>
+              </w:rPr>
+              <w:t xml:space="preserve">配置阶段现象</w:t>
+            </w:r>
+          </w:p>
+        </w:tc>
+        <w:tc>
+          <w:tcPr>
+            <w:tcW w:type="dxa" w:w="6846"/>
+            <w:tcBorders>
+              <w:top w:val="single" w:color="D5DBE3" w:sz="4"/>
+              <w:left w:val="single" w:color="D5DBE3" w:sz="4"/>
+              <w:bottom w:val="single" w:color="D5DBE3" w:sz="4"/>
+              <w:right w:val="single" w:color="D5DBE3" w:sz="4"/>
+            </w:tcBorders>
+            <w:shd w:fill="E8EEF5" w:val="clear"/>
+            <w:tcMar>
+              <w:top w:type="dxa" w:w="90"/>
+              <w:left w:type="dxa" w:w="100"/>
+              <w:bottom w:type="dxa" w:w="90"/>
+              <w:right w:type="dxa" w:w="100"/>
+            </w:tcMar>
+          </w:tcPr>
+          <w:p>
+            <w:pPr>
+              <w:spacing w:after="40" w:before="0" w:line="260"/>
+            </w:pPr>
+            <w:r>
+              <w:rPr>
+                <w:rFonts w:ascii="Arial" w:cs="Arial" w:eastAsia="Microsoft YaHei" w:hAnsi="Arial"/>
+                <w:b/>
+                <w:bCs/>
+                <w:sz w:val="18"/>
+                <w:szCs w:val="18"/>
+              </w:rPr>
+              <w:t xml:space="preserve">定位方向</w:t>
+            </w:r>
+          </w:p>
+        </w:tc>
+      </w:tr>
+      <w:tr>
+        <w:trPr>
+          <w:cantSplit/>
+          <w:tblHeader w:val="false"/>
+        </w:trPr>
+        <w:tc>
+          <w:tcPr>
+            <w:tcW w:type="dxa" w:w="2900"/>
+            <w:tcBorders>
+              <w:top w:val="single" w:color="D5DBE3" w:sz="4"/>
+              <w:left w:val="single" w:color="D5DBE3" w:sz="4"/>
+              <w:bottom w:val="single" w:color="D5DBE3" w:sz="4"/>
+              <w:right w:val="single" w:color="D5DBE3" w:sz="4"/>
+            </w:tcBorders>
+            <w:shd w:fill="FFFFFF" w:val="clear"/>
+            <w:tcMar>
+              <w:top w:type="dxa" w:w="90"/>
+              <w:left w:type="dxa" w:w="100"/>
+              <w:bottom w:type="dxa" w:w="90"/>
+              <w:right w:type="dxa" w:w="100"/>
+            </w:tcMar>
+          </w:tcPr>
+          <w:p>
+            <w:pPr>
+              <w:spacing w:after="40" w:before="0" w:line="260"/>
+            </w:pPr>
+            <w:r>
+              <w:rPr>
+                <w:rFonts w:ascii="Arial" w:cs="Arial" w:eastAsia="Microsoft YaHei" w:hAnsi="Arial"/>
+                <w:b w:val="false"/>
+                <w:bCs w:val="false"/>
+                <w:sz w:val="18"/>
+                <w:szCs w:val="18"/>
+              </w:rPr>
+              <w:t xml:space="preserve">找不到 ssh / scp</w:t>
+            </w:r>
+          </w:p>
+        </w:tc>
+        <w:tc>
+          <w:tcPr>
+            <w:tcW w:type="dxa" w:w="6846"/>
+            <w:tcBorders>
+              <w:top w:val="single" w:color="D5DBE3" w:sz="4"/>
+              <w:left w:val="single" w:color="D5DBE3" w:sz="4"/>
+              <w:bottom w:val="single" w:color="D5DBE3" w:sz="4"/>
+              <w:right w:val="single" w:color="D5DBE3" w:sz="4"/>
+            </w:tcBorders>
+            <w:shd w:fill="FFFFFF" w:val="clear"/>
+            <w:tcMar>
+              <w:top w:type="dxa" w:w="90"/>
+              <w:left w:type="dxa" w:w="100"/>
+              <w:bottom w:type="dxa" w:w="90"/>
+              <w:right w:type="dxa" w:w="100"/>
+            </w:tcMar>
+          </w:tcPr>
+          <w:p>
+            <w:pPr>
+              <w:spacing w:after="40" w:before="0" w:line="260"/>
+            </w:pPr>
+            <w:r>
+              <w:rPr>
+                <w:rFonts w:ascii="Arial" w:cs="Arial" w:eastAsia="Microsoft YaHei" w:hAnsi="Arial"/>
+                <w:b w:val="false"/>
+                <w:bCs w:val="false"/>
+                <w:sz w:val="18"/>
+                <w:szCs w:val="18"/>
+              </w:rPr>
+              <w:t xml:space="preserve">安装客户端、重新打开终端、检查 UI 的 PATH</w:t>
+            </w:r>
+          </w:p>
+        </w:tc>
+      </w:tr>
+      <w:tr>
+        <w:trPr>
+          <w:cantSplit/>
+          <w:tblHeader w:val="false"/>
+        </w:trPr>
+        <w:tc>
+          <w:tcPr>
+            <w:tcW w:type="dxa" w:w="2900"/>
+            <w:tcBorders>
+              <w:top w:val="single" w:color="D5DBE3" w:sz="4"/>
+              <w:left w:val="single" w:color="D5DBE3" w:sz="4"/>
+              <w:bottom w:val="single" w:color="D5DBE3" w:sz="4"/>
+              <w:right w:val="single" w:color="D5DBE3" w:sz="4"/>
+            </w:tcBorders>
+            <w:shd w:fill="FFFFFF" w:val="clear"/>
+            <w:tcMar>
+              <w:top w:type="dxa" w:w="90"/>
+              <w:left w:type="dxa" w:w="100"/>
+              <w:bottom w:type="dxa" w:w="90"/>
+              <w:right w:type="dxa" w:w="100"/>
+            </w:tcMar>
+          </w:tcPr>
+          <w:p>
+            <w:pPr>
+              <w:spacing w:after="40" w:before="0" w:line="260"/>
+            </w:pPr>
+            <w:r>
+              <w:rPr>
+                <w:rFonts w:ascii="Arial" w:cs="Arial" w:eastAsia="Microsoft YaHei" w:hAnsi="Arial"/>
+                <w:b w:val="false"/>
+                <w:bCs w:val="false"/>
+                <w:sz w:val="18"/>
+                <w:szCs w:val="18"/>
+              </w:rPr>
+              <w:t xml:space="preserve">TCP 连接超时 / 拒绝</w:t>
+            </w:r>
+          </w:p>
+        </w:tc>
+        <w:tc>
+          <w:tcPr>
+            <w:tcW w:type="dxa" w:w="6846"/>
+            <w:tcBorders>
+              <w:top w:val="single" w:color="D5DBE3" w:sz="4"/>
+              <w:left w:val="single" w:color="D5DBE3" w:sz="4"/>
+              <w:bottom w:val="single" w:color="D5DBE3" w:sz="4"/>
+              <w:right w:val="single" w:color="D5DBE3" w:sz="4"/>
+            </w:tcBorders>
+            <w:shd w:fill="FFFFFF" w:val="clear"/>
+            <w:tcMar>
+              <w:top w:type="dxa" w:w="90"/>
+              <w:left w:type="dxa" w:w="100"/>
+              <w:bottom w:type="dxa" w:w="90"/>
+              <w:right w:type="dxa" w:w="100"/>
+            </w:tcMar>
+          </w:tcPr>
+          <w:p>
+            <w:pPr>
+              <w:spacing w:after="40" w:before="0" w:line="260"/>
+            </w:pPr>
+            <w:r>
+              <w:rPr>
+                <w:rFonts w:ascii="Arial" w:cs="Arial" w:eastAsia="Microsoft YaHei" w:hAnsi="Arial"/>
+                <w:b w:val="false"/>
+                <w:bCs w:val="false"/>
+                <w:sz w:val="18"/>
+                <w:szCs w:val="18"/>
+              </w:rPr>
+              <w:t xml:space="preserve">企业网络/VPN、目标地址、sshd 服务、获准防火墙规则</w:t>
+            </w:r>
+          </w:p>
+        </w:tc>
+      </w:tr>
+      <w:tr>
+        <w:trPr>
+          <w:cantSplit/>
+          <w:tblHeader w:val="false"/>
+        </w:trPr>
+        <w:tc>
+          <w:tcPr>
+            <w:tcW w:type="dxa" w:w="2900"/>
+            <w:tcBorders>
+              <w:top w:val="single" w:color="D5DBE3" w:sz="4"/>
+              <w:left w:val="single" w:color="D5DBE3" w:sz="4"/>
+              <w:bottom w:val="single" w:color="D5DBE3" w:sz="4"/>
+              <w:right w:val="single" w:color="D5DBE3" w:sz="4"/>
+            </w:tcBorders>
+            <w:shd w:fill="FFFFFF" w:val="clear"/>
+            <w:tcMar>
+              <w:top w:type="dxa" w:w="90"/>
+              <w:left w:type="dxa" w:w="100"/>
+              <w:bottom w:type="dxa" w:w="90"/>
+              <w:right w:type="dxa" w:w="100"/>
+            </w:tcMar>
+          </w:tcPr>
+          <w:p>
+            <w:pPr>
+              <w:spacing w:after="40" w:before="0" w:line="260"/>
+            </w:pPr>
+            <w:r>
+              <w:rPr>
+                <w:rFonts w:ascii="Arial" w:cs="Arial" w:eastAsia="Microsoft YaHei" w:hAnsi="Arial"/>
+                <w:b w:val="false"/>
+                <w:bCs w:val="false"/>
+                <w:sz w:val="18"/>
+                <w:szCs w:val="18"/>
+              </w:rPr>
+              <w:t xml:space="preserve">Host key verification failed</w:t>
+            </w:r>
+          </w:p>
+        </w:tc>
+        <w:tc>
+          <w:tcPr>
+            <w:tcW w:type="dxa" w:w="6846"/>
+            <w:tcBorders>
+              <w:top w:val="single" w:color="D5DBE3" w:sz="4"/>
+              <w:left w:val="single" w:color="D5DBE3" w:sz="4"/>
+              <w:bottom w:val="single" w:color="D5DBE3" w:sz="4"/>
+              <w:right w:val="single" w:color="D5DBE3" w:sz="4"/>
+            </w:tcBorders>
+            <w:shd w:fill="FFFFFF" w:val="clear"/>
+            <w:tcMar>
+              <w:top w:type="dxa" w:w="90"/>
+              <w:left w:type="dxa" w:w="100"/>
+              <w:bottom w:type="dxa" w:w="90"/>
+              <w:right w:type="dxa" w:w="100"/>
+            </w:tcMar>
+          </w:tcPr>
+          <w:p>
+            <w:pPr>
+              <w:spacing w:after="40" w:before="0" w:line="260"/>
+            </w:pPr>
+            <w:r>
+              <w:rPr>
+                <w:rFonts w:ascii="Arial" w:cs="Arial" w:eastAsia="Microsoft YaHei" w:hAnsi="Arial"/>
+                <w:b w:val="false"/>
+                <w:bCs w:val="false"/>
+                <w:sz w:val="18"/>
+                <w:szCs w:val="18"/>
+              </w:rPr>
+              <w:t xml:space="preserve">专用 known_hosts 路径、实际匹配的 Host 段、主机指纹或别名</w:t>
+            </w:r>
+          </w:p>
+        </w:tc>
+      </w:tr>
+      <w:tr>
+        <w:trPr>
+          <w:cantSplit/>
+          <w:tblHeader w:val="false"/>
+        </w:trPr>
+        <w:tc>
+          <w:tcPr>
+            <w:tcW w:type="dxa" w:w="2900"/>
+            <w:tcBorders>
+              <w:top w:val="single" w:color="D5DBE3" w:sz="4"/>
+              <w:left w:val="single" w:color="D5DBE3" w:sz="4"/>
+              <w:bottom w:val="single" w:color="D5DBE3" w:sz="4"/>
+              <w:right w:val="single" w:color="D5DBE3" w:sz="4"/>
+            </w:tcBorders>
+            <w:shd w:fill="FFFFFF" w:val="clear"/>
+            <w:tcMar>
+              <w:top w:type="dxa" w:w="90"/>
+              <w:left w:type="dxa" w:w="100"/>
+              <w:bottom w:type="dxa" w:w="90"/>
+              <w:right w:type="dxa" w:w="100"/>
+            </w:tcMar>
+          </w:tcPr>
+          <w:p>
+            <w:pPr>
+              <w:spacing w:after="40" w:before="0" w:line="260"/>
+            </w:pPr>
+            <w:r>
+              <w:rPr>
+                <w:rFonts w:ascii="Arial" w:cs="Arial" w:eastAsia="Microsoft YaHei" w:hAnsi="Arial"/>
+                <w:b w:val="false"/>
+                <w:bCs w:val="false"/>
+                <w:sz w:val="18"/>
+                <w:szCs w:val="18"/>
+              </w:rPr>
+              <w:t xml:space="preserve">Permission denied (publickey)</w:t>
+            </w:r>
+          </w:p>
+        </w:tc>
+        <w:tc>
+          <w:tcPr>
+            <w:tcW w:type="dxa" w:w="6846"/>
+            <w:tcBorders>
+              <w:top w:val="single" w:color="D5DBE3" w:sz="4"/>
+              <w:left w:val="single" w:color="D5DBE3" w:sz="4"/>
+              <w:bottom w:val="single" w:color="D5DBE3" w:sz="4"/>
+              <w:right w:val="single" w:color="D5DBE3" w:sz="4"/>
+            </w:tcBorders>
+            <w:shd w:fill="FFFFFF" w:val="clear"/>
+            <w:tcMar>
+              <w:top w:type="dxa" w:w="90"/>
+              <w:left w:type="dxa" w:w="100"/>
+              <w:bottom w:type="dxa" w:w="90"/>
+              <w:right w:type="dxa" w:w="100"/>
+            </w:tcMar>
+          </w:tcPr>
+          <w:p>
+            <w:pPr>
+              <w:spacing w:after="40" w:before="0" w:line="260"/>
+            </w:pPr>
+            <w:r>
+              <w:rPr>
+                <w:rFonts w:ascii="Arial" w:cs="Arial" w:eastAsia="Microsoft YaHei" w:hAnsi="Arial"/>
+                <w:b w:val="false"/>
+                <w:bCs w:val="false"/>
+                <w:sz w:val="18"/>
+                <w:szCs w:val="18"/>
+              </w:rPr>
+              <w:t xml:space="preserve">远端账号、公钥授权文件、ACL、Match 规则及本机 identityFile</w:t>
+            </w:r>
+          </w:p>
+        </w:tc>
+      </w:tr>
+      <w:tr>
+        <w:trPr>
+          <w:cantSplit/>
+          <w:tblHeader w:val="false"/>
+        </w:trPr>
+        <w:tc>
+          <w:tcPr>
+            <w:tcW w:type="dxa" w:w="2900"/>
+            <w:tcBorders>
+              <w:top w:val="single" w:color="D5DBE3" w:sz="4"/>
+              <w:left w:val="single" w:color="D5DBE3" w:sz="4"/>
+              <w:bottom w:val="single" w:color="D5DBE3" w:sz="4"/>
+              <w:right w:val="single" w:color="D5DBE3" w:sz="4"/>
+            </w:tcBorders>
+            <w:shd w:fill="FFFFFF" w:val="clear"/>
+            <w:tcMar>
+              <w:top w:type="dxa" w:w="90"/>
+              <w:left w:type="dxa" w:w="100"/>
+              <w:bottom w:type="dxa" w:w="90"/>
+              <w:right w:type="dxa" w:w="100"/>
+            </w:tcMar>
+          </w:tcPr>
+          <w:p>
+            <w:pPr>
+              <w:spacing w:after="40" w:before="0" w:line="260"/>
+            </w:pPr>
+            <w:r>
+              <w:rPr>
+                <w:rFonts w:ascii="Arial" w:cs="Arial" w:eastAsia="Microsoft YaHei" w:hAnsi="Arial"/>
+                <w:b w:val="false"/>
+                <w:bCs w:val="false"/>
+                <w:sz w:val="18"/>
+                <w:szCs w:val="18"/>
+              </w:rPr>
+              <w:t xml:space="preserve">手工可登录但系统预检失败</w:t>
+            </w:r>
+          </w:p>
+        </w:tc>
+        <w:tc>
+          <w:tcPr>
+            <w:tcW w:type="dxa" w:w="6846"/>
+            <w:tcBorders>
+              <w:top w:val="single" w:color="D5DBE3" w:sz="4"/>
+              <w:left w:val="single" w:color="D5DBE3" w:sz="4"/>
+              <w:bottom w:val="single" w:color="D5DBE3" w:sz="4"/>
+              <w:right w:val="single" w:color="D5DBE3" w:sz="4"/>
+            </w:tcBorders>
+            <w:shd w:fill="FFFFFF" w:val="clear"/>
+            <w:tcMar>
+              <w:top w:type="dxa" w:w="90"/>
+              <w:left w:type="dxa" w:w="100"/>
+              <w:bottom w:type="dxa" w:w="90"/>
+              <w:right w:type="dxa" w:w="100"/>
+            </w:tcMar>
+          </w:tcPr>
+          <w:p>
+            <w:pPr>
+              <w:spacing w:after="40" w:before="0" w:line="260"/>
+            </w:pPr>
+            <w:r>
+              <w:rPr>
+                <w:rFonts w:ascii="Arial" w:cs="Arial" w:eastAsia="Microsoft YaHei" w:hAnsi="Arial"/>
+                <w:b w:val="false"/>
+                <w:bCs w:val="false"/>
+                <w:sz w:val="18"/>
+                <w:szCs w:val="18"/>
+              </w:rPr>
+              <w:t xml:space="preserve">手工可能依赖密码/口令交互；核对 agent、BatchMode、Windows 用户和 SSH 实现</w:t>
+            </w:r>
+          </w:p>
+        </w:tc>
+      </w:tr>
+      <w:tr>
+        <w:trPr>
+          <w:cantSplit/>
+          <w:tblHeader w:val="false"/>
+        </w:trPr>
+        <w:tc>
+          <w:tcPr>
+            <w:tcW w:type="dxa" w:w="2900"/>
+            <w:tcBorders>
+              <w:top w:val="single" w:color="D5DBE3" w:sz="4"/>
+              <w:left w:val="single" w:color="D5DBE3" w:sz="4"/>
+              <w:bottom w:val="single" w:color="D5DBE3" w:sz="4"/>
+              <w:right w:val="single" w:color="D5DBE3" w:sz="4"/>
+            </w:tcBorders>
+            <w:shd w:fill="FFFFFF" w:val="clear"/>
+            <w:tcMar>
+              <w:top w:type="dxa" w:w="90"/>
+              <w:left w:type="dxa" w:w="100"/>
+              <w:bottom w:type="dxa" w:w="90"/>
+              <w:right w:type="dxa" w:w="100"/>
+            </w:tcMar>
+          </w:tcPr>
+          <w:p>
+            <w:pPr>
+              <w:spacing w:after="40" w:before="0" w:line="260"/>
+            </w:pPr>
+            <w:r>
+              <w:rPr>
+                <w:rFonts w:ascii="Arial" w:cs="Arial" w:eastAsia="Microsoft YaHei" w:hAnsi="Arial"/>
+                <w:b w:val="false"/>
+                <w:bCs w:val="false"/>
+                <w:sz w:val="18"/>
+                <w:szCs w:val="18"/>
+              </w:rPr>
+              <w:t xml:space="preserve">SSH_OK 后硬件命令仍失败</w:t>
+            </w:r>
+          </w:p>
+        </w:tc>
+        <w:tc>
+          <w:tcPr>
+            <w:tcW w:type="dxa" w:w="6846"/>
+            <w:tcBorders>
+              <w:top w:val="single" w:color="D5DBE3" w:sz="4"/>
+              <w:left w:val="single" w:color="D5DBE3" w:sz="4"/>
+              <w:bottom w:val="single" w:color="D5DBE3" w:sz="4"/>
+              <w:right w:val="single" w:color="D5DBE3" w:sz="4"/>
+            </w:tcBorders>
+            <w:shd w:fill="FFFFFF" w:val="clear"/>
+            <w:tcMar>
+              <w:top w:type="dxa" w:w="90"/>
+              <w:left w:type="dxa" w:w="100"/>
+              <w:bottom w:type="dxa" w:w="90"/>
+              <w:right w:type="dxa" w:w="100"/>
+            </w:tcMar>
+          </w:tcPr>
+          <w:p>
+            <w:pPr>
+              <w:spacing w:after="40" w:before="0" w:line="260"/>
+            </w:pPr>
+            <w:r>
+              <w:rPr>
+                <w:rFonts w:ascii="Arial" w:cs="Arial" w:eastAsia="Microsoft YaHei" w:hAnsi="Arial"/>
+                <w:b w:val="false"/>
+                <w:bCs w:val="false"/>
+                <w:sz w:val="18"/>
+                <w:szCs w:val="18"/>
+              </w:rPr>
+              <w:t xml:space="preserve">远端工具路径、Windows 账号权限、设备占用及硬件配置，不再混同于 SSH 配置</w:t>
+            </w:r>
+          </w:p>
+        </w:tc>
+      </w:tr>
+    </w:tbl>
+    <w:p>
+      <w:pPr>
+        <w:spacing w:after="60"/>
+      </w:pPr>
+    </w:p>
+    <w:p>
+      <w:pPr>
+        <w:spacing w:after="120" w:line="300"/>
+      </w:pPr>
+      <w:r>
+        <w:rPr>
+          <w:rFonts w:ascii="Arial" w:cs="Arial" w:eastAsia="Microsoft YaHei" w:hAnsi="Arial"/>
+        </w:rPr>
+        <w:t xml:space="preserve">接收人签收时登记“客户端安装、个人公钥授权、指纹核对、本机配置、SSH_OK / 退出码、控制机负责人”六项结果即可；记录中不要附加私钥、保护口令或其他凭据。Windows 公钥部署参考：https://learn.microsoft.com/en-us/windows-server/administration/openssh/openssh_keymanagement 。</w:t>
       </w:r>
     </w:p>
     <w:p>

</xml_diff>